<commit_message>
Week 4: Added High-Level Design (HLD) following IBM standards
</commit_message>
<xml_diff>
--- a/HLD_Report.docx
+++ b/HLD_Report.docx
@@ -41,19 +41,63 @@
           <w:rFonts w:ascii="Times New Roman" w:hAnsi="Times New Roman" w:cs="Times New Roman"/>
           <w:b/>
           <w:bCs/>
-          <w:sz w:val="48"/>
-          <w:szCs w:val="48"/>
-        </w:rPr>
-      </w:pPr>
-      <w:r>
-        <w:rPr>
-          <w:rFonts w:ascii="Times New Roman" w:hAnsi="Times New Roman" w:cs="Times New Roman"/>
-          <w:b/>
-          <w:bCs/>
-          <w:sz w:val="48"/>
-          <w:szCs w:val="48"/>
-        </w:rPr>
-        <w:t>YENEPOYA DEEMED TO BE UNIVERSITY</w:t>
+          <w:sz w:val="40"/>
+          <w:szCs w:val="40"/>
+        </w:rPr>
+      </w:pPr>
+      <w:proofErr w:type="spellStart"/>
+      <w:r>
+        <w:rPr>
+          <w:rFonts w:ascii="Times New Roman" w:hAnsi="Times New Roman" w:cs="Times New Roman"/>
+          <w:b/>
+          <w:bCs/>
+          <w:sz w:val="40"/>
+          <w:szCs w:val="40"/>
+        </w:rPr>
+        <w:t>Y</w:t>
+      </w:r>
+      <w:r>
+        <w:rPr>
+          <w:rFonts w:ascii="Times New Roman" w:hAnsi="Times New Roman" w:cs="Times New Roman"/>
+          <w:b/>
+          <w:bCs/>
+          <w:sz w:val="40"/>
+          <w:szCs w:val="40"/>
+        </w:rPr>
+        <w:t>enepoya</w:t>
+      </w:r>
+      <w:proofErr w:type="spellEnd"/>
+      <w:r>
+        <w:rPr>
+          <w:rFonts w:ascii="Times New Roman" w:hAnsi="Times New Roman" w:cs="Times New Roman"/>
+          <w:b/>
+          <w:bCs/>
+          <w:sz w:val="40"/>
+          <w:szCs w:val="40"/>
+        </w:rPr>
+        <w:t xml:space="preserve"> Institute </w:t>
+      </w:r>
+      <w:proofErr w:type="gramStart"/>
+      <w:r>
+        <w:rPr>
+          <w:rFonts w:ascii="Times New Roman" w:hAnsi="Times New Roman" w:cs="Times New Roman"/>
+          <w:b/>
+          <w:bCs/>
+          <w:sz w:val="40"/>
+          <w:szCs w:val="40"/>
+        </w:rPr>
+        <w:t>Of</w:t>
+      </w:r>
+      <w:proofErr w:type="gramEnd"/>
+      <w:r>
+        <w:rPr>
+          <w:rFonts w:ascii="Times New Roman" w:hAnsi="Times New Roman" w:cs="Times New Roman"/>
+          <w:b/>
+          <w:bCs/>
+          <w:sz w:val="40"/>
+          <w:szCs w:val="40"/>
+        </w:rPr>
+        <w:t xml:space="preserve"> Arts, Science, Commerce &amp; Management</w:t>
       </w:r>
     </w:p>
     <w:p>
@@ -63,11 +107,90 @@
           <w:rFonts w:ascii="Times New Roman" w:hAnsi="Times New Roman" w:cs="Times New Roman"/>
           <w:b/>
           <w:bCs/>
-          <w:sz w:val="36"/>
-          <w:szCs w:val="36"/>
-        </w:rPr>
-      </w:pPr>
-      <w:r>
+          <w:sz w:val="40"/>
+          <w:szCs w:val="40"/>
+        </w:rPr>
+      </w:pPr>
+      <w:r>
+        <w:rPr>
+          <w:rFonts w:ascii="Times New Roman" w:hAnsi="Times New Roman" w:cs="Times New Roman"/>
+          <w:b/>
+          <w:bCs/>
+          <w:sz w:val="40"/>
+          <w:szCs w:val="40"/>
+        </w:rPr>
+        <w:t xml:space="preserve">Project – High Level Design </w:t>
+      </w:r>
+    </w:p>
+    <w:p>
+      <w:pPr>
+        <w:jc w:val="center"/>
+        <w:rPr>
+          <w:rFonts w:ascii="Times New Roman" w:hAnsi="Times New Roman" w:cs="Times New Roman"/>
+          <w:b/>
+          <w:bCs/>
+          <w:sz w:val="40"/>
+          <w:szCs w:val="40"/>
+        </w:rPr>
+      </w:pPr>
+      <w:r>
+        <w:rPr>
+          <w:rFonts w:ascii="Times New Roman" w:hAnsi="Times New Roman" w:cs="Times New Roman"/>
+          <w:b/>
+          <w:bCs/>
+          <w:sz w:val="40"/>
+          <w:szCs w:val="40"/>
+        </w:rPr>
+        <w:t xml:space="preserve">on </w:t>
+      </w:r>
+    </w:p>
+    <w:p>
+      <w:pPr>
+        <w:jc w:val="center"/>
+        <w:rPr>
+          <w:rFonts w:ascii="Times New Roman" w:hAnsi="Times New Roman" w:cs="Times New Roman"/>
+          <w:b/>
+          <w:bCs/>
+          <w:sz w:val="40"/>
+          <w:szCs w:val="40"/>
+        </w:rPr>
+      </w:pPr>
+      <w:r>
+        <w:rPr>
+          <w:rFonts w:ascii="Times New Roman" w:hAnsi="Times New Roman" w:cs="Times New Roman"/>
+          <w:b/>
+          <w:bCs/>
+          <w:sz w:val="40"/>
+          <w:szCs w:val="40"/>
+        </w:rPr>
+        <w:t xml:space="preserve">Cloud Cost Intelligent Platform </w:t>
+      </w:r>
+      <w:proofErr w:type="gramStart"/>
+      <w:r>
+        <w:rPr>
+          <w:rFonts w:ascii="Times New Roman" w:hAnsi="Times New Roman" w:cs="Times New Roman"/>
+          <w:b/>
+          <w:bCs/>
+          <w:sz w:val="40"/>
+          <w:szCs w:val="40"/>
+        </w:rPr>
+        <w:t>For</w:t>
+      </w:r>
+      <w:proofErr w:type="gramEnd"/>
+      <w:r>
+        <w:rPr>
+          <w:rFonts w:ascii="Times New Roman" w:hAnsi="Times New Roman" w:cs="Times New Roman"/>
+          <w:b/>
+          <w:bCs/>
+          <w:sz w:val="40"/>
+          <w:szCs w:val="40"/>
+        </w:rPr>
+        <w:t xml:space="preserve"> Agriculture </w:t>
+      </w:r>
+    </w:p>
+    <w:p>
+      <w:pPr>
+        <w:jc w:val="center"/>
         <w:rPr>
           <w:rFonts w:ascii="Times New Roman" w:hAnsi="Times New Roman" w:cs="Times New Roman"/>
           <w:b/>
@@ -75,21 +198,11 @@
           <w:sz w:val="44"/>
           <w:szCs w:val="44"/>
         </w:rPr>
-        <w:t xml:space="preserve">Project – High Level Design </w:t>
-      </w:r>
+      </w:pPr>
     </w:p>
     <w:p>
       <w:pPr>
         <w:jc w:val="center"/>
-        <w:rPr>
-          <w:rFonts w:ascii="Times New Roman" w:hAnsi="Times New Roman" w:cs="Times New Roman"/>
-          <w:b/>
-          <w:bCs/>
-          <w:sz w:val="36"/>
-          <w:szCs w:val="36"/>
-        </w:rPr>
-      </w:pPr>
-      <w:r>
         <w:rPr>
           <w:rFonts w:ascii="Times New Roman" w:hAnsi="Times New Roman" w:cs="Times New Roman"/>
           <w:b/>
@@ -97,8 +210,7 @@
           <w:sz w:val="44"/>
           <w:szCs w:val="44"/>
         </w:rPr>
-        <w:t xml:space="preserve">on </w:t>
-      </w:r>
+      </w:pPr>
     </w:p>
     <w:p>
       <w:pPr>
@@ -111,81 +223,14 @@
           <w:szCs w:val="44"/>
         </w:rPr>
       </w:pPr>
-      <w:r>
-        <w:rPr>
-          <w:rFonts w:ascii="Times New Roman" w:hAnsi="Times New Roman" w:cs="Times New Roman"/>
-          <w:b/>
-          <w:bCs/>
-          <w:sz w:val="44"/>
-          <w:szCs w:val="44"/>
-        </w:rPr>
-        <w:t xml:space="preserve">Cloud Cost Intelligent Platform </w:t>
-      </w:r>
-      <w:proofErr w:type="gramStart"/>
-      <w:r>
-        <w:rPr>
-          <w:rFonts w:ascii="Times New Roman" w:hAnsi="Times New Roman" w:cs="Times New Roman"/>
-          <w:b/>
-          <w:bCs/>
-          <w:sz w:val="44"/>
-          <w:szCs w:val="44"/>
-        </w:rPr>
-        <w:t>For</w:t>
-      </w:r>
-      <w:proofErr w:type="gramEnd"/>
-      <w:r>
-        <w:rPr>
-          <w:rFonts w:ascii="Times New Roman" w:hAnsi="Times New Roman" w:cs="Times New Roman"/>
-          <w:b/>
-          <w:bCs/>
-          <w:sz w:val="44"/>
-          <w:szCs w:val="44"/>
-        </w:rPr>
-        <w:t xml:space="preserve"> Agriculture </w:t>
-      </w:r>
-    </w:p>
-    <w:p>
-      <w:pPr>
-        <w:jc w:val="center"/>
-        <w:rPr>
-          <w:rFonts w:ascii="Times New Roman" w:hAnsi="Times New Roman" w:cs="Times New Roman"/>
-          <w:b/>
-          <w:bCs/>
-          <w:sz w:val="44"/>
-          <w:szCs w:val="44"/>
-        </w:rPr>
-      </w:pPr>
-    </w:p>
-    <w:p>
-      <w:pPr>
-        <w:jc w:val="center"/>
-        <w:rPr>
-          <w:rFonts w:ascii="Times New Roman" w:hAnsi="Times New Roman" w:cs="Times New Roman"/>
-          <w:b/>
-          <w:bCs/>
-          <w:sz w:val="44"/>
-          <w:szCs w:val="44"/>
-        </w:rPr>
-      </w:pPr>
-    </w:p>
-    <w:p>
-      <w:pPr>
-        <w:jc w:val="center"/>
-        <w:rPr>
-          <w:rFonts w:ascii="Times New Roman" w:hAnsi="Times New Roman" w:cs="Times New Roman"/>
-          <w:b/>
-          <w:bCs/>
-          <w:sz w:val="44"/>
-          <w:szCs w:val="44"/>
-        </w:rPr>
-      </w:pPr>
-    </w:p>
-    <w:p>
-      <w:pPr>
-        <w:rPr>
-          <w:rFonts w:ascii="Times New Roman" w:hAnsi="Times New Roman" w:cs="Times New Roman"/>
-          <w:b/>
-          <w:bCs/>
+    </w:p>
+    <w:p>
+      <w:pPr>
+        <w:rPr>
+          <w:rFonts w:ascii="Times New Roman" w:hAnsi="Times New Roman" w:cs="Times New Roman"/>
+          <w:b/>
+          <w:bCs/>
+          <w:color w:val="000000" w:themeColor="text1"/>
           <w:sz w:val="36"/>
           <w:szCs w:val="36"/>
           <w:u w:val="single"/>
@@ -196,6 +241,7 @@
           <w:rFonts w:ascii="Times New Roman" w:hAnsi="Times New Roman" w:cs="Times New Roman"/>
           <w:b/>
           <w:bCs/>
+          <w:color w:val="000000" w:themeColor="text1"/>
           <w:sz w:val="36"/>
           <w:szCs w:val="36"/>
           <w:u w:val="single"/>
@@ -205,8 +251,7 @@
       <w:r>
         <w:rPr>
           <w:rFonts w:ascii="Times New Roman" w:hAnsi="Times New Roman" w:cs="Times New Roman"/>
-          <w:b/>
-          <w:bCs/>
+          <w:color w:val="000000" w:themeColor="text1"/>
           <w:sz w:val="36"/>
           <w:szCs w:val="36"/>
           <w:u w:val="single"/>
@@ -2190,15 +2235,7 @@
           <w:sz w:val="28"/>
           <w:szCs w:val="28"/>
         </w:rPr>
-        <w:t>cloud computing sectors.</w:t>
-      </w:r>
-      <w:r>
-        <w:rPr>
-          <w:rFonts w:ascii="Times New Roman" w:hAnsi="Times New Roman" w:cs="Times New Roman"/>
-          <w:sz w:val="28"/>
-          <w:szCs w:val="28"/>
-        </w:rPr>
-        <w:t xml:space="preserve"> </w:t>
+        <w:t xml:space="preserve">cloud computing sectors. </w:t>
       </w:r>
     </w:p>
     <w:p>
@@ -2617,15 +2654,7 @@
           <w:sz w:val="28"/>
           <w:szCs w:val="28"/>
         </w:rPr>
-        <w:t xml:space="preserve">       </w:t>
-      </w:r>
-      <w:r>
-        <w:rPr>
-          <w:rFonts w:ascii="Times New Roman" w:hAnsi="Times New Roman" w:cs="Times New Roman"/>
-          <w:sz w:val="28"/>
-          <w:szCs w:val="28"/>
-        </w:rPr>
-        <w:t xml:space="preserve">   2.  System loads 1,200+ rows of synthetic agriculture data</w:t>
+        <w:t xml:space="preserve">          2.  System loads 1,200+ rows of synthetic agriculture data</w:t>
       </w:r>
     </w:p>
     <w:p>
@@ -2912,15 +2941,7 @@
           <w:sz w:val="28"/>
           <w:szCs w:val="28"/>
         </w:rPr>
-        <w:t>and finally rendered as visual charts (Information Consumption).</w:t>
-      </w:r>
-      <w:r>
-        <w:rPr>
-          <w:rFonts w:ascii="Times New Roman" w:hAnsi="Times New Roman" w:cs="Times New Roman"/>
-          <w:sz w:val="28"/>
-          <w:szCs w:val="28"/>
-        </w:rPr>
-        <w:t xml:space="preserve"> </w:t>
+        <w:t xml:space="preserve">and finally rendered as visual charts (Information Consumption). </w:t>
       </w:r>
       <w:r>
         <w:rPr>
@@ -5140,15 +5161,7 @@
           <w:sz w:val="28"/>
           <w:szCs w:val="28"/>
         </w:rPr>
-        <w:t xml:space="preserve">        </w:t>
-      </w:r>
-      <w:r>
-        <w:rPr>
-          <w:rFonts w:ascii="Times New Roman" w:hAnsi="Times New Roman" w:cs="Times New Roman"/>
-          <w:sz w:val="28"/>
-          <w:szCs w:val="28"/>
-        </w:rPr>
-        <w:t>cloud</w:t>
+        <w:t xml:space="preserve">        cloud</w:t>
       </w:r>
       <w:r>
         <w:rPr>
@@ -7131,6 +7144,7 @@
   <w:style w:type="character" w:default="1" w:styleId="DefaultParagraphFont">
     <w:name w:val="Default Paragraph Font"/>
     <w:uiPriority w:val="1"/>
+    <w:semiHidden/>
     <w:unhideWhenUsed/>
   </w:style>
   <w:style w:type="table" w:default="1" w:styleId="TableNormal">

</xml_diff>

<commit_message>
Update: Final polished versions of HLD and LLD
</commit_message>
<xml_diff>
--- a/HLD_Report.docx
+++ b/HLD_Report.docx
@@ -111,7 +111,10 @@
           <w:szCs w:val="40"/>
         </w:rPr>
       </w:pPr>
-      <w:r>
+    </w:p>
+    <w:p>
+      <w:pPr>
+        <w:jc w:val="center"/>
         <w:rPr>
           <w:rFonts w:ascii="Times New Roman" w:hAnsi="Times New Roman" w:cs="Times New Roman"/>
           <w:b/>
@@ -119,8 +122,7 @@
           <w:sz w:val="40"/>
           <w:szCs w:val="40"/>
         </w:rPr>
-        <w:t xml:space="preserve">Project – High Level Design </w:t>
-      </w:r>
+      </w:pPr>
     </w:p>
     <w:p>
       <w:pPr>
@@ -141,7 +143,7 @@
           <w:sz w:val="40"/>
           <w:szCs w:val="40"/>
         </w:rPr>
-        <w:t xml:space="preserve">on </w:t>
+        <w:t xml:space="preserve">Project – High Level Design </w:t>
       </w:r>
     </w:p>
     <w:p>
@@ -163,10 +165,12 @@
           <w:sz w:val="40"/>
           <w:szCs w:val="40"/>
         </w:rPr>
-        <w:t xml:space="preserve">Cloud Cost Intelligent Platform </w:t>
-      </w:r>
-      <w:proofErr w:type="gramStart"/>
-      <w:r>
+        <w:t xml:space="preserve">on </w:t>
+      </w:r>
+    </w:p>
+    <w:p>
+      <w:pPr>
+        <w:jc w:val="center"/>
         <w:rPr>
           <w:rFonts w:ascii="Times New Roman" w:hAnsi="Times New Roman" w:cs="Times New Roman"/>
           <w:b/>
@@ -174,9 +178,7 @@
           <w:sz w:val="40"/>
           <w:szCs w:val="40"/>
         </w:rPr>
-        <w:t>For</w:t>
-      </w:r>
-      <w:proofErr w:type="gramEnd"/>
+      </w:pPr>
       <w:r>
         <w:rPr>
           <w:rFonts w:ascii="Times New Roman" w:hAnsi="Times New Roman" w:cs="Times New Roman"/>
@@ -185,6 +187,28 @@
           <w:sz w:val="40"/>
           <w:szCs w:val="40"/>
         </w:rPr>
+        <w:t xml:space="preserve">Cloud Cost Intelligent Platform </w:t>
+      </w:r>
+      <w:proofErr w:type="gramStart"/>
+      <w:r>
+        <w:rPr>
+          <w:rFonts w:ascii="Times New Roman" w:hAnsi="Times New Roman" w:cs="Times New Roman"/>
+          <w:b/>
+          <w:bCs/>
+          <w:sz w:val="40"/>
+          <w:szCs w:val="40"/>
+        </w:rPr>
+        <w:t>For</w:t>
+      </w:r>
+      <w:proofErr w:type="gramEnd"/>
+      <w:r>
+        <w:rPr>
+          <w:rFonts w:ascii="Times New Roman" w:hAnsi="Times New Roman" w:cs="Times New Roman"/>
+          <w:b/>
+          <w:bCs/>
+          <w:sz w:val="40"/>
+          <w:szCs w:val="40"/>
+        </w:rPr>
         <w:t xml:space="preserve"> Agriculture </w:t>
       </w:r>
     </w:p>
@@ -226,38 +250,156 @@
     </w:p>
     <w:p>
       <w:pPr>
+        <w:spacing w:after="240"/>
         <w:rPr>
           <w:rFonts w:ascii="Times New Roman" w:hAnsi="Times New Roman" w:cs="Times New Roman"/>
           <w:b/>
           <w:bCs/>
           <w:color w:val="000000" w:themeColor="text1"/>
+          <w:sz w:val="32"/>
+          <w:szCs w:val="32"/>
+        </w:rPr>
+      </w:pPr>
+      <w:r>
+        <w:rPr>
+          <w:rFonts w:ascii="Times New Roman" w:hAnsi="Times New Roman" w:cs="Times New Roman"/>
+          <w:b/>
+          <w:bCs/>
+          <w:color w:val="000000" w:themeColor="text1"/>
+          <w:sz w:val="32"/>
+          <w:szCs w:val="32"/>
+        </w:rPr>
+        <w:t xml:space="preserve">Student Name: </w:t>
+      </w:r>
+      <w:r>
+        <w:rPr>
+          <w:rFonts w:ascii="Times New Roman" w:hAnsi="Times New Roman" w:cs="Times New Roman"/>
+          <w:color w:val="000000" w:themeColor="text1"/>
+          <w:sz w:val="32"/>
+          <w:szCs w:val="32"/>
+        </w:rPr>
+        <w:t>Mohammed Ashraf</w:t>
+      </w:r>
+    </w:p>
+    <w:p>
+      <w:pPr>
+        <w:rPr>
+          <w:rFonts w:ascii="Times New Roman" w:hAnsi="Times New Roman" w:cs="Times New Roman"/>
+          <w:b/>
+          <w:bCs/>
           <w:sz w:val="36"/>
           <w:szCs w:val="36"/>
           <w:u w:val="single"/>
         </w:rPr>
       </w:pPr>
-      <w:r>
-        <w:rPr>
-          <w:rFonts w:ascii="Times New Roman" w:hAnsi="Times New Roman" w:cs="Times New Roman"/>
-          <w:b/>
-          <w:bCs/>
-          <w:color w:val="000000" w:themeColor="text1"/>
+    </w:p>
+    <w:p>
+      <w:pPr>
+        <w:rPr>
+          <w:rFonts w:ascii="Times New Roman" w:hAnsi="Times New Roman" w:cs="Times New Roman"/>
+          <w:b/>
+          <w:bCs/>
           <w:sz w:val="36"/>
           <w:szCs w:val="36"/>
           <w:u w:val="single"/>
         </w:rPr>
-        <w:t xml:space="preserve">Student Name: </w:t>
-      </w:r>
-      <w:r>
-        <w:rPr>
-          <w:rFonts w:ascii="Times New Roman" w:hAnsi="Times New Roman" w:cs="Times New Roman"/>
-          <w:color w:val="000000" w:themeColor="text1"/>
+      </w:pPr>
+    </w:p>
+    <w:p>
+      <w:pPr>
+        <w:rPr>
+          <w:rFonts w:ascii="Times New Roman" w:hAnsi="Times New Roman" w:cs="Times New Roman"/>
+          <w:b/>
+          <w:bCs/>
           <w:sz w:val="36"/>
           <w:szCs w:val="36"/>
           <w:u w:val="single"/>
         </w:rPr>
-        <w:t>Mohammed Ashraf</w:t>
-      </w:r>
+      </w:pPr>
+    </w:p>
+    <w:p>
+      <w:pPr>
+        <w:tabs>
+          <w:tab w:val="left" w:pos="6276"/>
+        </w:tabs>
+        <w:rPr>
+          <w:rFonts w:ascii="Times New Roman" w:hAnsi="Times New Roman" w:cs="Times New Roman"/>
+          <w:b/>
+          <w:bCs/>
+          <w:sz w:val="36"/>
+          <w:szCs w:val="36"/>
+        </w:rPr>
+      </w:pPr>
+      <w:r>
+        <w:rPr>
+          <w:rFonts w:ascii="Times New Roman" w:hAnsi="Times New Roman" w:cs="Times New Roman"/>
+          <w:b/>
+          <w:bCs/>
+          <w:sz w:val="32"/>
+          <w:szCs w:val="32"/>
+        </w:rPr>
+        <w:t xml:space="preserve">Industry Mentor: </w:t>
+      </w:r>
+      <w:proofErr w:type="spellStart"/>
+      <w:r>
+        <w:rPr>
+          <w:rFonts w:ascii="Times New Roman" w:hAnsi="Times New Roman" w:cs="Times New Roman"/>
+          <w:sz w:val="32"/>
+          <w:szCs w:val="32"/>
+        </w:rPr>
+        <w:t>Mr</w:t>
+      </w:r>
+      <w:proofErr w:type="spellEnd"/>
+      <w:r>
+        <w:rPr>
+          <w:rFonts w:ascii="Times New Roman" w:hAnsi="Times New Roman" w:cs="Times New Roman"/>
+          <w:sz w:val="32"/>
+          <w:szCs w:val="32"/>
+        </w:rPr>
+        <w:t xml:space="preserve"> Sumit Kumar</w:t>
+      </w:r>
+      <w:r>
+        <w:rPr>
+          <w:rFonts w:ascii="Times New Roman" w:hAnsi="Times New Roman" w:cs="Times New Roman"/>
+          <w:sz w:val="36"/>
+          <w:szCs w:val="36"/>
+        </w:rPr>
+        <w:t xml:space="preserve">            </w:t>
+      </w:r>
+      <w:r>
+        <w:rPr>
+          <w:rFonts w:ascii="Times New Roman" w:hAnsi="Times New Roman" w:cs="Times New Roman"/>
+          <w:b/>
+          <w:bCs/>
+          <w:sz w:val="32"/>
+          <w:szCs w:val="32"/>
+        </w:rPr>
+        <w:t xml:space="preserve">Guided by: </w:t>
+      </w:r>
+      <w:proofErr w:type="spellStart"/>
+      <w:proofErr w:type="gramStart"/>
+      <w:r>
+        <w:rPr>
+          <w:rFonts w:ascii="Times New Roman" w:hAnsi="Times New Roman" w:cs="Times New Roman"/>
+          <w:b/>
+          <w:bCs/>
+          <w:sz w:val="32"/>
+          <w:szCs w:val="32"/>
+        </w:rPr>
+        <w:t>Ms</w:t>
+      </w:r>
+      <w:r>
+        <w:rPr>
+          <w:rFonts w:ascii="Times New Roman" w:hAnsi="Times New Roman" w:cs="Times New Roman"/>
+          <w:b/>
+          <w:bCs/>
+          <w:sz w:val="32"/>
+          <w:szCs w:val="32"/>
+        </w:rPr>
+        <w:t>.Niharika</w:t>
+      </w:r>
+      <w:proofErr w:type="spellEnd"/>
+      <w:proofErr w:type="gramEnd"/>
     </w:p>
     <w:p>
       <w:pPr>
@@ -295,106 +437,6 @@
         </w:rPr>
       </w:pPr>
     </w:p>
-    <w:tbl>
-      <w:tblPr>
-        <w:tblStyle w:val="TableGrid"/>
-        <w:tblW w:w="5226" w:type="pct"/>
-        <w:tblBorders>
-          <w:top w:val="none" w:sz="0" w:space="0" w:color="auto"/>
-          <w:left w:val="none" w:sz="0" w:space="0" w:color="auto"/>
-          <w:bottom w:val="none" w:sz="0" w:space="0" w:color="auto"/>
-          <w:right w:val="none" w:sz="0" w:space="0" w:color="auto"/>
-          <w:insideH w:val="none" w:sz="0" w:space="0" w:color="auto"/>
-          <w:insideV w:val="none" w:sz="0" w:space="0" w:color="auto"/>
-        </w:tblBorders>
-        <w:tblLook w:val="04A0" w:firstRow="1" w:lastRow="0" w:firstColumn="1" w:lastColumn="0" w:noHBand="0" w:noVBand="1"/>
-      </w:tblPr>
-      <w:tblGrid>
-        <w:gridCol w:w="2392"/>
-        <w:gridCol w:w="2816"/>
-        <w:gridCol w:w="1847"/>
-        <w:gridCol w:w="2728"/>
-      </w:tblGrid>
-      <w:tr>
-        <w:tc>
-          <w:tcPr>
-            <w:tcW w:w="1223" w:type="pct"/>
-          </w:tcPr>
-          <w:p>
-            <w:pPr>
-              <w:rPr>
-                <w:rFonts w:ascii="Times New Roman" w:hAnsi="Times New Roman" w:cs="Times New Roman"/>
-                <w:b/>
-                <w:bCs/>
-                <w:sz w:val="28"/>
-              </w:rPr>
-            </w:pPr>
-            <w:r>
-              <w:rPr>
-                <w:rFonts w:ascii="Times New Roman" w:hAnsi="Times New Roman" w:cs="Times New Roman"/>
-                <w:b/>
-                <w:bCs/>
-                <w:sz w:val="28"/>
-              </w:rPr>
-              <w:t xml:space="preserve">Industry Mentor: </w:t>
-            </w:r>
-          </w:p>
-        </w:tc>
-        <w:tc>
-          <w:tcPr>
-            <w:tcW w:w="1439" w:type="pct"/>
-          </w:tcPr>
-          <w:p>
-            <w:pPr>
-              <w:rPr>
-                <w:rFonts w:ascii="Times New Roman" w:hAnsi="Times New Roman" w:cs="Times New Roman"/>
-                <w:sz w:val="28"/>
-              </w:rPr>
-            </w:pPr>
-          </w:p>
-        </w:tc>
-        <w:tc>
-          <w:tcPr>
-            <w:tcW w:w="944" w:type="pct"/>
-          </w:tcPr>
-          <w:p>
-            <w:pPr>
-              <w:jc w:val="right"/>
-              <w:rPr>
-                <w:rFonts w:ascii="Times New Roman" w:hAnsi="Times New Roman" w:cs="Times New Roman"/>
-                <w:b/>
-                <w:bCs/>
-                <w:sz w:val="28"/>
-              </w:rPr>
-            </w:pPr>
-            <w:r>
-              <w:rPr>
-                <w:rFonts w:ascii="Times New Roman" w:hAnsi="Times New Roman" w:cs="Times New Roman"/>
-                <w:b/>
-                <w:bCs/>
-                <w:sz w:val="28"/>
-              </w:rPr>
-              <w:t xml:space="preserve"> Guided by: </w:t>
-            </w:r>
-          </w:p>
-        </w:tc>
-        <w:tc>
-          <w:tcPr>
-            <w:tcW w:w="1394" w:type="pct"/>
-          </w:tcPr>
-          <w:p>
-            <w:pPr>
-              <w:rPr>
-                <w:rFonts w:ascii="Times New Roman" w:hAnsi="Times New Roman" w:cs="Times New Roman"/>
-                <w:b/>
-                <w:bCs/>
-                <w:sz w:val="28"/>
-              </w:rPr>
-            </w:pPr>
-          </w:p>
-        </w:tc>
-      </w:tr>
-    </w:tbl>
     <w:p>
       <w:pPr>
         <w:rPr>
@@ -409,6 +451,7 @@
     </w:p>
     <w:p>
       <w:pPr>
+        <w:jc w:val="center"/>
         <w:rPr>
           <w:rFonts w:ascii="Times New Roman" w:hAnsi="Times New Roman" w:cs="Times New Roman"/>
           <w:b/>
@@ -421,6 +464,7 @@
     </w:p>
     <w:p>
       <w:pPr>
+        <w:jc w:val="center"/>
         <w:rPr>
           <w:rFonts w:ascii="Times New Roman" w:hAnsi="Times New Roman" w:cs="Times New Roman"/>
           <w:b/>
@@ -430,9 +474,7 @@
           <w:u w:val="single"/>
         </w:rPr>
       </w:pPr>
-    </w:p>
-    <w:p>
-      <w:pPr>
+      <w:r>
         <w:rPr>
           <w:rFonts w:ascii="Times New Roman" w:hAnsi="Times New Roman" w:cs="Times New Roman"/>
           <w:b/>
@@ -441,77 +483,12 @@
           <w:szCs w:val="36"/>
           <w:u w:val="single"/>
         </w:rPr>
-      </w:pPr>
-    </w:p>
-    <w:p>
-      <w:pPr>
-        <w:rPr>
-          <w:rFonts w:ascii="Times New Roman" w:hAnsi="Times New Roman" w:cs="Times New Roman"/>
-          <w:b/>
-          <w:bCs/>
-          <w:sz w:val="36"/>
-          <w:szCs w:val="36"/>
-          <w:u w:val="single"/>
-        </w:rPr>
-      </w:pPr>
-    </w:p>
-    <w:p>
-      <w:pPr>
-        <w:jc w:val="center"/>
-        <w:rPr>
-          <w:rFonts w:ascii="Times New Roman" w:hAnsi="Times New Roman" w:cs="Times New Roman"/>
-          <w:b/>
-          <w:bCs/>
-          <w:sz w:val="36"/>
-          <w:szCs w:val="36"/>
-          <w:u w:val="single"/>
-        </w:rPr>
-      </w:pPr>
-    </w:p>
-    <w:p>
-      <w:pPr>
-        <w:jc w:val="center"/>
-        <w:rPr>
-          <w:rFonts w:ascii="Times New Roman" w:hAnsi="Times New Roman" w:cs="Times New Roman"/>
-          <w:b/>
-          <w:bCs/>
-          <w:sz w:val="36"/>
-          <w:szCs w:val="36"/>
-          <w:u w:val="single"/>
-        </w:rPr>
-      </w:pPr>
-      <w:r>
-        <w:rPr>
-          <w:rFonts w:ascii="Times New Roman" w:hAnsi="Times New Roman" w:cs="Times New Roman"/>
-          <w:b/>
-          <w:bCs/>
-          <w:sz w:val="36"/>
-          <w:szCs w:val="36"/>
-          <w:u w:val="single"/>
-        </w:rPr>
         <w:t>Table of Contents</w:t>
       </w:r>
     </w:p>
     <w:p>
       <w:pPr>
-        <w:rPr>
-          <w:rFonts w:ascii="Times New Roman" w:hAnsi="Times New Roman" w:cs="Times New Roman"/>
-          <w:b/>
-          <w:bCs/>
-          <w:sz w:val="36"/>
-          <w:szCs w:val="36"/>
-          <w:u w:val="single"/>
-        </w:rPr>
-      </w:pPr>
-    </w:p>
-    <w:p>
-      <w:pPr>
-        <w:pStyle w:val="ListParagraph"/>
         <w:widowControl w:val="0"/>
-        <w:numPr>
-          <w:ilvl w:val="0"/>
-          <w:numId w:val="1"/>
-        </w:numPr>
         <w:tabs>
           <w:tab w:val="left" w:pos="359"/>
           <w:tab w:val="right" w:leader="dot" w:pos="8975"/>
@@ -519,25 +496,35 @@
         <w:autoSpaceDE w:val="0"/>
         <w:autoSpaceDN w:val="0"/>
         <w:spacing w:before="458" w:after="0" w:line="240" w:lineRule="auto"/>
-        <w:ind w:left="359" w:hanging="359"/>
-        <w:contextualSpacing w:val="0"/>
-        <w:rPr>
-          <w:rFonts w:ascii="Times New Roman" w:hAnsi="Times New Roman" w:cs="Times New Roman"/>
-          <w:sz w:val="23"/>
-        </w:rPr>
-      </w:pPr>
+        <w:rPr>
+          <w:rFonts w:ascii="Times New Roman" w:hAnsi="Times New Roman" w:cs="Times New Roman"/>
+          <w:sz w:val="28"/>
+          <w:szCs w:val="28"/>
+        </w:rPr>
+      </w:pPr>
+      <w:r>
+        <w:rPr>
+          <w:rFonts w:ascii="Times New Roman" w:hAnsi="Times New Roman" w:cs="Times New Roman"/>
+          <w:sz w:val="32"/>
+          <w:szCs w:val="32"/>
+          <w:u w:val="single"/>
+        </w:rPr>
+        <w:t>1.</w:t>
+      </w:r>
       <w:r>
         <w:rPr>
           <w:rFonts w:ascii="Times New Roman" w:hAnsi="Times New Roman" w:cs="Times New Roman"/>
           <w:spacing w:val="-2"/>
-          <w:sz w:val="23"/>
+          <w:sz w:val="28"/>
+          <w:szCs w:val="28"/>
         </w:rPr>
         <w:t>Introduction.</w:t>
       </w:r>
       <w:r>
         <w:rPr>
           <w:rFonts w:ascii="Times New Roman" w:hAnsi="Times New Roman" w:cs="Times New Roman"/>
-          <w:sz w:val="23"/>
+          <w:sz w:val="28"/>
+          <w:szCs w:val="28"/>
         </w:rPr>
         <w:tab/>
       </w:r>
@@ -545,9 +532,10 @@
         <w:rPr>
           <w:rFonts w:ascii="Times New Roman" w:hAnsi="Times New Roman" w:cs="Times New Roman"/>
           <w:spacing w:val="-10"/>
-          <w:sz w:val="23"/>
-        </w:rPr>
-        <w:t>6</w:t>
+          <w:sz w:val="28"/>
+          <w:szCs w:val="28"/>
+        </w:rPr>
+        <w:t>3</w:t>
       </w:r>
     </w:p>
     <w:p>
@@ -569,13 +557,15 @@
         <w:contextualSpacing w:val="0"/>
         <w:rPr>
           <w:rFonts w:ascii="Times New Roman" w:hAnsi="Times New Roman" w:cs="Times New Roman"/>
-          <w:sz w:val="20"/>
-        </w:rPr>
-      </w:pPr>
-      <w:r>
-        <w:rPr>
-          <w:rFonts w:ascii="Times New Roman" w:hAnsi="Times New Roman" w:cs="Times New Roman"/>
-          <w:sz w:val="20"/>
+          <w:sz w:val="28"/>
+          <w:szCs w:val="28"/>
+        </w:rPr>
+      </w:pPr>
+      <w:r>
+        <w:rPr>
+          <w:rFonts w:ascii="Times New Roman" w:hAnsi="Times New Roman" w:cs="Times New Roman"/>
+          <w:sz w:val="28"/>
+          <w:szCs w:val="28"/>
         </w:rPr>
         <w:t>Scope</w:t>
       </w:r>
@@ -583,14 +573,16 @@
         <w:rPr>
           <w:rFonts w:ascii="Times New Roman" w:hAnsi="Times New Roman" w:cs="Times New Roman"/>
           <w:spacing w:val="-3"/>
-          <w:sz w:val="20"/>
+          <w:sz w:val="28"/>
+          <w:szCs w:val="28"/>
         </w:rPr>
         <w:t xml:space="preserve"> </w:t>
       </w:r>
       <w:r>
         <w:rPr>
           <w:rFonts w:ascii="Times New Roman" w:hAnsi="Times New Roman" w:cs="Times New Roman"/>
-          <w:sz w:val="20"/>
+          <w:sz w:val="28"/>
+          <w:szCs w:val="28"/>
         </w:rPr>
         <w:t>of</w:t>
       </w:r>
@@ -598,14 +590,16 @@
         <w:rPr>
           <w:rFonts w:ascii="Times New Roman" w:hAnsi="Times New Roman" w:cs="Times New Roman"/>
           <w:spacing w:val="-2"/>
-          <w:sz w:val="20"/>
+          <w:sz w:val="28"/>
+          <w:szCs w:val="28"/>
         </w:rPr>
         <w:t xml:space="preserve"> </w:t>
       </w:r>
       <w:r>
         <w:rPr>
           <w:rFonts w:ascii="Times New Roman" w:hAnsi="Times New Roman" w:cs="Times New Roman"/>
-          <w:sz w:val="20"/>
+          <w:sz w:val="28"/>
+          <w:szCs w:val="28"/>
         </w:rPr>
         <w:t>the</w:t>
       </w:r>
@@ -613,7 +607,8 @@
         <w:rPr>
           <w:rFonts w:ascii="Times New Roman" w:hAnsi="Times New Roman" w:cs="Times New Roman"/>
           <w:spacing w:val="-3"/>
-          <w:sz w:val="20"/>
+          <w:sz w:val="28"/>
+          <w:szCs w:val="28"/>
         </w:rPr>
         <w:t xml:space="preserve"> </w:t>
       </w:r>
@@ -621,14 +616,16 @@
         <w:rPr>
           <w:rFonts w:ascii="Times New Roman" w:hAnsi="Times New Roman" w:cs="Times New Roman"/>
           <w:spacing w:val="-2"/>
-          <w:sz w:val="20"/>
+          <w:sz w:val="28"/>
+          <w:szCs w:val="28"/>
         </w:rPr>
         <w:t>document.</w:t>
       </w:r>
       <w:r>
         <w:rPr>
           <w:rFonts w:ascii="Times New Roman" w:hAnsi="Times New Roman" w:cs="Times New Roman"/>
-          <w:sz w:val="20"/>
+          <w:sz w:val="28"/>
+          <w:szCs w:val="28"/>
         </w:rPr>
         <w:tab/>
       </w:r>
@@ -636,9 +633,10 @@
         <w:rPr>
           <w:rFonts w:ascii="Times New Roman" w:hAnsi="Times New Roman" w:cs="Times New Roman"/>
           <w:spacing w:val="-10"/>
-          <w:sz w:val="20"/>
-        </w:rPr>
-        <w:t>6</w:t>
+          <w:sz w:val="28"/>
+          <w:szCs w:val="28"/>
+        </w:rPr>
+        <w:t>3</w:t>
       </w:r>
     </w:p>
     <w:p>
@@ -660,13 +658,15 @@
         <w:contextualSpacing w:val="0"/>
         <w:rPr>
           <w:rFonts w:ascii="Times New Roman" w:hAnsi="Times New Roman" w:cs="Times New Roman"/>
-          <w:sz w:val="20"/>
-        </w:rPr>
-      </w:pPr>
-      <w:r>
-        <w:rPr>
-          <w:rFonts w:ascii="Times New Roman" w:hAnsi="Times New Roman" w:cs="Times New Roman"/>
-          <w:sz w:val="20"/>
+          <w:sz w:val="28"/>
+          <w:szCs w:val="28"/>
+        </w:rPr>
+      </w:pPr>
+      <w:r>
+        <w:rPr>
+          <w:rFonts w:ascii="Times New Roman" w:hAnsi="Times New Roman" w:cs="Times New Roman"/>
+          <w:sz w:val="28"/>
+          <w:szCs w:val="28"/>
         </w:rPr>
         <w:t>Intended</w:t>
       </w:r>
@@ -674,7 +674,8 @@
         <w:rPr>
           <w:rFonts w:ascii="Times New Roman" w:hAnsi="Times New Roman" w:cs="Times New Roman"/>
           <w:spacing w:val="-5"/>
-          <w:sz w:val="20"/>
+          <w:sz w:val="28"/>
+          <w:szCs w:val="28"/>
         </w:rPr>
         <w:t xml:space="preserve"> </w:t>
       </w:r>
@@ -682,14 +683,16 @@
         <w:rPr>
           <w:rFonts w:ascii="Times New Roman" w:hAnsi="Times New Roman" w:cs="Times New Roman"/>
           <w:spacing w:val="-2"/>
-          <w:sz w:val="20"/>
+          <w:sz w:val="28"/>
+          <w:szCs w:val="28"/>
         </w:rPr>
         <w:t>Audience</w:t>
       </w:r>
       <w:r>
         <w:rPr>
           <w:rFonts w:ascii="Times New Roman" w:hAnsi="Times New Roman" w:cs="Times New Roman"/>
-          <w:sz w:val="20"/>
+          <w:sz w:val="28"/>
+          <w:szCs w:val="28"/>
         </w:rPr>
         <w:tab/>
       </w:r>
@@ -697,9 +700,10 @@
         <w:rPr>
           <w:rFonts w:ascii="Times New Roman" w:hAnsi="Times New Roman" w:cs="Times New Roman"/>
           <w:spacing w:val="-10"/>
-          <w:sz w:val="20"/>
-        </w:rPr>
-        <w:t>6</w:t>
+          <w:sz w:val="28"/>
+          <w:szCs w:val="28"/>
+        </w:rPr>
+        <w:t>3</w:t>
       </w:r>
     </w:p>
     <w:p>
@@ -721,13 +725,15 @@
         <w:contextualSpacing w:val="0"/>
         <w:rPr>
           <w:rFonts w:ascii="Times New Roman" w:hAnsi="Times New Roman" w:cs="Times New Roman"/>
-          <w:sz w:val="20"/>
-        </w:rPr>
-      </w:pPr>
-      <w:r>
-        <w:rPr>
-          <w:rFonts w:ascii="Times New Roman" w:hAnsi="Times New Roman" w:cs="Times New Roman"/>
-          <w:sz w:val="20"/>
+          <w:sz w:val="28"/>
+          <w:szCs w:val="28"/>
+        </w:rPr>
+      </w:pPr>
+      <w:r>
+        <w:rPr>
+          <w:rFonts w:ascii="Times New Roman" w:hAnsi="Times New Roman" w:cs="Times New Roman"/>
+          <w:sz w:val="28"/>
+          <w:szCs w:val="28"/>
         </w:rPr>
         <w:t>System</w:t>
       </w:r>
@@ -735,7 +741,8 @@
         <w:rPr>
           <w:rFonts w:ascii="Times New Roman" w:hAnsi="Times New Roman" w:cs="Times New Roman"/>
           <w:spacing w:val="-6"/>
-          <w:sz w:val="20"/>
+          <w:sz w:val="28"/>
+          <w:szCs w:val="28"/>
         </w:rPr>
         <w:t xml:space="preserve"> </w:t>
       </w:r>
@@ -743,14 +750,16 @@
         <w:rPr>
           <w:rFonts w:ascii="Times New Roman" w:hAnsi="Times New Roman" w:cs="Times New Roman"/>
           <w:spacing w:val="-2"/>
-          <w:sz w:val="20"/>
+          <w:sz w:val="28"/>
+          <w:szCs w:val="28"/>
         </w:rPr>
         <w:t>overview.</w:t>
       </w:r>
       <w:r>
         <w:rPr>
           <w:rFonts w:ascii="Times New Roman" w:hAnsi="Times New Roman" w:cs="Times New Roman"/>
-          <w:sz w:val="20"/>
+          <w:sz w:val="28"/>
+          <w:szCs w:val="28"/>
         </w:rPr>
         <w:tab/>
       </w:r>
@@ -758,19 +767,15 @@
         <w:rPr>
           <w:rFonts w:ascii="Times New Roman" w:hAnsi="Times New Roman" w:cs="Times New Roman"/>
           <w:spacing w:val="-10"/>
-          <w:sz w:val="20"/>
-        </w:rPr>
-        <w:t>6</w:t>
-      </w:r>
-    </w:p>
-    <w:p>
-      <w:pPr>
-        <w:pStyle w:val="ListParagraph"/>
+          <w:sz w:val="28"/>
+          <w:szCs w:val="28"/>
+        </w:rPr>
+        <w:t>3</w:t>
+      </w:r>
+    </w:p>
+    <w:p>
+      <w:pPr>
         <w:widowControl w:val="0"/>
-        <w:numPr>
-          <w:ilvl w:val="0"/>
-          <w:numId w:val="1"/>
-        </w:numPr>
         <w:tabs>
           <w:tab w:val="left" w:pos="359"/>
           <w:tab w:val="right" w:leader="dot" w:pos="9052"/>
@@ -778,17 +783,25 @@
         <w:autoSpaceDE w:val="0"/>
         <w:autoSpaceDN w:val="0"/>
         <w:spacing w:before="229" w:after="0" w:line="240" w:lineRule="auto"/>
-        <w:ind w:left="359" w:hanging="359"/>
-        <w:contextualSpacing w:val="0"/>
-        <w:rPr>
-          <w:rFonts w:ascii="Times New Roman" w:hAnsi="Times New Roman" w:cs="Times New Roman"/>
-          <w:sz w:val="23"/>
-        </w:rPr>
-      </w:pPr>
-      <w:r>
-        <w:rPr>
-          <w:rFonts w:ascii="Times New Roman" w:hAnsi="Times New Roman" w:cs="Times New Roman"/>
-          <w:sz w:val="23"/>
+        <w:rPr>
+          <w:rFonts w:ascii="Times New Roman" w:hAnsi="Times New Roman" w:cs="Times New Roman"/>
+          <w:sz w:val="28"/>
+          <w:szCs w:val="28"/>
+        </w:rPr>
+      </w:pPr>
+      <w:r>
+        <w:rPr>
+          <w:rFonts w:ascii="Times New Roman" w:hAnsi="Times New Roman" w:cs="Times New Roman"/>
+          <w:sz w:val="28"/>
+          <w:szCs w:val="28"/>
+        </w:rPr>
+        <w:t>2.</w:t>
+      </w:r>
+      <w:r>
+        <w:rPr>
+          <w:rFonts w:ascii="Times New Roman" w:hAnsi="Times New Roman" w:cs="Times New Roman"/>
+          <w:sz w:val="28"/>
+          <w:szCs w:val="28"/>
         </w:rPr>
         <w:t>System</w:t>
       </w:r>
@@ -796,7 +809,8 @@
         <w:rPr>
           <w:rFonts w:ascii="Times New Roman" w:hAnsi="Times New Roman" w:cs="Times New Roman"/>
           <w:spacing w:val="-1"/>
-          <w:sz w:val="23"/>
+          <w:sz w:val="28"/>
+          <w:szCs w:val="28"/>
         </w:rPr>
         <w:t xml:space="preserve"> </w:t>
       </w:r>
@@ -804,14 +818,16 @@
         <w:rPr>
           <w:rFonts w:ascii="Times New Roman" w:hAnsi="Times New Roman" w:cs="Times New Roman"/>
           <w:spacing w:val="-2"/>
-          <w:sz w:val="23"/>
+          <w:sz w:val="28"/>
+          <w:szCs w:val="28"/>
         </w:rPr>
         <w:t>Design.</w:t>
       </w:r>
       <w:r>
         <w:rPr>
           <w:rFonts w:ascii="Times New Roman" w:hAnsi="Times New Roman" w:cs="Times New Roman"/>
-          <w:sz w:val="23"/>
+          <w:sz w:val="28"/>
+          <w:szCs w:val="28"/>
         </w:rPr>
         <w:tab/>
       </w:r>
@@ -819,9 +835,10 @@
         <w:rPr>
           <w:rFonts w:ascii="Times New Roman" w:hAnsi="Times New Roman" w:cs="Times New Roman"/>
           <w:spacing w:val="-10"/>
-          <w:sz w:val="23"/>
-        </w:rPr>
-        <w:t>6</w:t>
+          <w:sz w:val="28"/>
+          <w:szCs w:val="28"/>
+        </w:rPr>
+        <w:t>4</w:t>
       </w:r>
     </w:p>
     <w:p>
@@ -843,13 +860,15 @@
         <w:contextualSpacing w:val="0"/>
         <w:rPr>
           <w:rFonts w:ascii="Times New Roman" w:hAnsi="Times New Roman" w:cs="Times New Roman"/>
-          <w:sz w:val="20"/>
-        </w:rPr>
-      </w:pPr>
-      <w:r>
-        <w:rPr>
-          <w:rFonts w:ascii="Times New Roman" w:hAnsi="Times New Roman" w:cs="Times New Roman"/>
-          <w:sz w:val="20"/>
+          <w:sz w:val="28"/>
+          <w:szCs w:val="28"/>
+        </w:rPr>
+      </w:pPr>
+      <w:r>
+        <w:rPr>
+          <w:rFonts w:ascii="Times New Roman" w:hAnsi="Times New Roman" w:cs="Times New Roman"/>
+          <w:sz w:val="28"/>
+          <w:szCs w:val="28"/>
         </w:rPr>
         <w:t>Application</w:t>
       </w:r>
@@ -857,7 +876,8 @@
         <w:rPr>
           <w:rFonts w:ascii="Times New Roman" w:hAnsi="Times New Roman" w:cs="Times New Roman"/>
           <w:spacing w:val="-5"/>
-          <w:sz w:val="20"/>
+          <w:sz w:val="28"/>
+          <w:szCs w:val="28"/>
         </w:rPr>
         <w:t xml:space="preserve"> </w:t>
       </w:r>
@@ -865,14 +885,16 @@
         <w:rPr>
           <w:rFonts w:ascii="Times New Roman" w:hAnsi="Times New Roman" w:cs="Times New Roman"/>
           <w:spacing w:val="-2"/>
-          <w:sz w:val="20"/>
+          <w:sz w:val="28"/>
+          <w:szCs w:val="28"/>
         </w:rPr>
         <w:t>Design</w:t>
       </w:r>
       <w:r>
         <w:rPr>
           <w:rFonts w:ascii="Times New Roman" w:hAnsi="Times New Roman" w:cs="Times New Roman"/>
-          <w:sz w:val="20"/>
+          <w:sz w:val="28"/>
+          <w:szCs w:val="28"/>
         </w:rPr>
         <w:tab/>
       </w:r>
@@ -880,9 +902,10 @@
         <w:rPr>
           <w:rFonts w:ascii="Times New Roman" w:hAnsi="Times New Roman" w:cs="Times New Roman"/>
           <w:spacing w:val="-10"/>
-          <w:sz w:val="20"/>
-        </w:rPr>
-        <w:t>6</w:t>
+          <w:sz w:val="28"/>
+          <w:szCs w:val="28"/>
+        </w:rPr>
+        <w:t>4</w:t>
       </w:r>
     </w:p>
     <w:p>
@@ -904,13 +927,15 @@
         <w:contextualSpacing w:val="0"/>
         <w:rPr>
           <w:rFonts w:ascii="Times New Roman" w:hAnsi="Times New Roman" w:cs="Times New Roman"/>
-          <w:sz w:val="20"/>
-        </w:rPr>
-      </w:pPr>
-      <w:r>
-        <w:rPr>
-          <w:rFonts w:ascii="Times New Roman" w:hAnsi="Times New Roman" w:cs="Times New Roman"/>
-          <w:sz w:val="20"/>
+          <w:sz w:val="28"/>
+          <w:szCs w:val="28"/>
+        </w:rPr>
+      </w:pPr>
+      <w:r>
+        <w:rPr>
+          <w:rFonts w:ascii="Times New Roman" w:hAnsi="Times New Roman" w:cs="Times New Roman"/>
+          <w:sz w:val="28"/>
+          <w:szCs w:val="28"/>
         </w:rPr>
         <w:t>Process</w:t>
       </w:r>
@@ -918,7 +943,8 @@
         <w:rPr>
           <w:rFonts w:ascii="Times New Roman" w:hAnsi="Times New Roman" w:cs="Times New Roman"/>
           <w:spacing w:val="-8"/>
-          <w:sz w:val="20"/>
+          <w:sz w:val="28"/>
+          <w:szCs w:val="28"/>
         </w:rPr>
         <w:t xml:space="preserve"> </w:t>
       </w:r>
@@ -926,14 +952,16 @@
         <w:rPr>
           <w:rFonts w:ascii="Times New Roman" w:hAnsi="Times New Roman" w:cs="Times New Roman"/>
           <w:spacing w:val="-2"/>
-          <w:sz w:val="20"/>
+          <w:sz w:val="28"/>
+          <w:szCs w:val="28"/>
         </w:rPr>
         <w:t>Flow.</w:t>
       </w:r>
       <w:r>
         <w:rPr>
           <w:rFonts w:ascii="Times New Roman" w:hAnsi="Times New Roman" w:cs="Times New Roman"/>
-          <w:sz w:val="20"/>
+          <w:sz w:val="28"/>
+          <w:szCs w:val="28"/>
         </w:rPr>
         <w:tab/>
       </w:r>
@@ -941,9 +969,10 @@
         <w:rPr>
           <w:rFonts w:ascii="Times New Roman" w:hAnsi="Times New Roman" w:cs="Times New Roman"/>
           <w:spacing w:val="-10"/>
-          <w:sz w:val="20"/>
-        </w:rPr>
-        <w:t>6</w:t>
+          <w:sz w:val="28"/>
+          <w:szCs w:val="28"/>
+        </w:rPr>
+        <w:t>4</w:t>
       </w:r>
     </w:p>
     <w:p>
@@ -965,13 +994,15 @@
         <w:contextualSpacing w:val="0"/>
         <w:rPr>
           <w:rFonts w:ascii="Times New Roman" w:hAnsi="Times New Roman" w:cs="Times New Roman"/>
-          <w:sz w:val="20"/>
-        </w:rPr>
-      </w:pPr>
-      <w:r>
-        <w:rPr>
-          <w:rFonts w:ascii="Times New Roman" w:hAnsi="Times New Roman" w:cs="Times New Roman"/>
-          <w:sz w:val="20"/>
+          <w:sz w:val="28"/>
+          <w:szCs w:val="28"/>
+        </w:rPr>
+      </w:pPr>
+      <w:r>
+        <w:rPr>
+          <w:rFonts w:ascii="Times New Roman" w:hAnsi="Times New Roman" w:cs="Times New Roman"/>
+          <w:sz w:val="28"/>
+          <w:szCs w:val="28"/>
         </w:rPr>
         <w:t>Information</w:t>
       </w:r>
@@ -979,7 +1010,8 @@
         <w:rPr>
           <w:rFonts w:ascii="Times New Roman" w:hAnsi="Times New Roman" w:cs="Times New Roman"/>
           <w:spacing w:val="-8"/>
-          <w:sz w:val="20"/>
+          <w:sz w:val="28"/>
+          <w:szCs w:val="28"/>
         </w:rPr>
         <w:t xml:space="preserve"> </w:t>
       </w:r>
@@ -987,14 +1019,16 @@
         <w:rPr>
           <w:rFonts w:ascii="Times New Roman" w:hAnsi="Times New Roman" w:cs="Times New Roman"/>
           <w:spacing w:val="-4"/>
-          <w:sz w:val="20"/>
+          <w:sz w:val="28"/>
+          <w:szCs w:val="28"/>
         </w:rPr>
         <w:t>Flow.</w:t>
       </w:r>
       <w:r>
         <w:rPr>
           <w:rFonts w:ascii="Times New Roman" w:hAnsi="Times New Roman" w:cs="Times New Roman"/>
-          <w:sz w:val="20"/>
+          <w:sz w:val="28"/>
+          <w:szCs w:val="28"/>
         </w:rPr>
         <w:tab/>
       </w:r>
@@ -1002,9 +1036,10 @@
         <w:rPr>
           <w:rFonts w:ascii="Times New Roman" w:hAnsi="Times New Roman" w:cs="Times New Roman"/>
           <w:spacing w:val="-10"/>
-          <w:sz w:val="20"/>
-        </w:rPr>
-        <w:t>7</w:t>
+          <w:sz w:val="28"/>
+          <w:szCs w:val="28"/>
+        </w:rPr>
+        <w:t>4</w:t>
       </w:r>
     </w:p>
     <w:p>
@@ -1026,13 +1061,15 @@
         <w:contextualSpacing w:val="0"/>
         <w:rPr>
           <w:rFonts w:ascii="Times New Roman" w:hAnsi="Times New Roman" w:cs="Times New Roman"/>
-          <w:sz w:val="20"/>
-        </w:rPr>
-      </w:pPr>
-      <w:r>
-        <w:rPr>
-          <w:rFonts w:ascii="Times New Roman" w:hAnsi="Times New Roman" w:cs="Times New Roman"/>
-          <w:sz w:val="20"/>
+          <w:sz w:val="28"/>
+          <w:szCs w:val="28"/>
+        </w:rPr>
+      </w:pPr>
+      <w:r>
+        <w:rPr>
+          <w:rFonts w:ascii="Times New Roman" w:hAnsi="Times New Roman" w:cs="Times New Roman"/>
+          <w:sz w:val="28"/>
+          <w:szCs w:val="28"/>
         </w:rPr>
         <w:t>Components</w:t>
       </w:r>
@@ -1040,7 +1077,8 @@
         <w:rPr>
           <w:rFonts w:ascii="Times New Roman" w:hAnsi="Times New Roman" w:cs="Times New Roman"/>
           <w:spacing w:val="-8"/>
-          <w:sz w:val="20"/>
+          <w:sz w:val="28"/>
+          <w:szCs w:val="28"/>
         </w:rPr>
         <w:t xml:space="preserve"> </w:t>
       </w:r>
@@ -1048,14 +1086,16 @@
         <w:rPr>
           <w:rFonts w:ascii="Times New Roman" w:hAnsi="Times New Roman" w:cs="Times New Roman"/>
           <w:spacing w:val="-2"/>
-          <w:sz w:val="20"/>
+          <w:sz w:val="28"/>
+          <w:szCs w:val="28"/>
         </w:rPr>
         <w:t>Design</w:t>
       </w:r>
       <w:r>
         <w:rPr>
           <w:rFonts w:ascii="Times New Roman" w:hAnsi="Times New Roman" w:cs="Times New Roman"/>
-          <w:sz w:val="20"/>
+          <w:sz w:val="28"/>
+          <w:szCs w:val="28"/>
         </w:rPr>
         <w:tab/>
       </w:r>
@@ -1063,9 +1103,10 @@
         <w:rPr>
           <w:rFonts w:ascii="Times New Roman" w:hAnsi="Times New Roman" w:cs="Times New Roman"/>
           <w:spacing w:val="-10"/>
-          <w:sz w:val="20"/>
-        </w:rPr>
-        <w:t>8</w:t>
+          <w:sz w:val="28"/>
+          <w:szCs w:val="28"/>
+        </w:rPr>
+        <w:t>5</w:t>
       </w:r>
     </w:p>
     <w:p>
@@ -1087,13 +1128,15 @@
         <w:contextualSpacing w:val="0"/>
         <w:rPr>
           <w:rFonts w:ascii="Times New Roman" w:hAnsi="Times New Roman" w:cs="Times New Roman"/>
-          <w:sz w:val="20"/>
-        </w:rPr>
-      </w:pPr>
-      <w:r>
-        <w:rPr>
-          <w:rFonts w:ascii="Times New Roman" w:hAnsi="Times New Roman" w:cs="Times New Roman"/>
-          <w:sz w:val="20"/>
+          <w:sz w:val="28"/>
+          <w:szCs w:val="28"/>
+        </w:rPr>
+      </w:pPr>
+      <w:r>
+        <w:rPr>
+          <w:rFonts w:ascii="Times New Roman" w:hAnsi="Times New Roman" w:cs="Times New Roman"/>
+          <w:sz w:val="28"/>
+          <w:szCs w:val="28"/>
         </w:rPr>
         <w:t>Key</w:t>
       </w:r>
@@ -1101,14 +1144,16 @@
         <w:rPr>
           <w:rFonts w:ascii="Times New Roman" w:hAnsi="Times New Roman" w:cs="Times New Roman"/>
           <w:spacing w:val="-4"/>
-          <w:sz w:val="20"/>
+          <w:sz w:val="28"/>
+          <w:szCs w:val="28"/>
         </w:rPr>
         <w:t xml:space="preserve"> </w:t>
       </w:r>
       <w:r>
         <w:rPr>
           <w:rFonts w:ascii="Times New Roman" w:hAnsi="Times New Roman" w:cs="Times New Roman"/>
-          <w:sz w:val="20"/>
+          <w:sz w:val="28"/>
+          <w:szCs w:val="28"/>
         </w:rPr>
         <w:t>Design</w:t>
       </w:r>
@@ -1116,7 +1161,8 @@
         <w:rPr>
           <w:rFonts w:ascii="Times New Roman" w:hAnsi="Times New Roman" w:cs="Times New Roman"/>
           <w:spacing w:val="-3"/>
-          <w:sz w:val="20"/>
+          <w:sz w:val="28"/>
+          <w:szCs w:val="28"/>
         </w:rPr>
         <w:t xml:space="preserve"> </w:t>
       </w:r>
@@ -1124,14 +1170,16 @@
         <w:rPr>
           <w:rFonts w:ascii="Times New Roman" w:hAnsi="Times New Roman" w:cs="Times New Roman"/>
           <w:spacing w:val="-2"/>
-          <w:sz w:val="20"/>
+          <w:sz w:val="28"/>
+          <w:szCs w:val="28"/>
         </w:rPr>
         <w:t>Considerations</w:t>
       </w:r>
       <w:r>
         <w:rPr>
           <w:rFonts w:ascii="Times New Roman" w:hAnsi="Times New Roman" w:cs="Times New Roman"/>
-          <w:sz w:val="20"/>
+          <w:sz w:val="28"/>
+          <w:szCs w:val="28"/>
         </w:rPr>
         <w:tab/>
       </w:r>
@@ -1139,9 +1187,10 @@
         <w:rPr>
           <w:rFonts w:ascii="Times New Roman" w:hAnsi="Times New Roman" w:cs="Times New Roman"/>
           <w:spacing w:val="-10"/>
-          <w:sz w:val="20"/>
-        </w:rPr>
-        <w:t>8</w:t>
+          <w:sz w:val="28"/>
+          <w:szCs w:val="28"/>
+        </w:rPr>
+        <w:t>5</w:t>
       </w:r>
     </w:p>
     <w:p>
@@ -1163,13 +1212,15 @@
         <w:contextualSpacing w:val="0"/>
         <w:rPr>
           <w:rFonts w:ascii="Times New Roman" w:hAnsi="Times New Roman" w:cs="Times New Roman"/>
-          <w:sz w:val="20"/>
-        </w:rPr>
-      </w:pPr>
-      <w:r>
-        <w:rPr>
-          <w:rFonts w:ascii="Times New Roman" w:hAnsi="Times New Roman" w:cs="Times New Roman"/>
-          <w:sz w:val="20"/>
+          <w:sz w:val="28"/>
+          <w:szCs w:val="28"/>
+        </w:rPr>
+      </w:pPr>
+      <w:r>
+        <w:rPr>
+          <w:rFonts w:ascii="Times New Roman" w:hAnsi="Times New Roman" w:cs="Times New Roman"/>
+          <w:sz w:val="28"/>
+          <w:szCs w:val="28"/>
         </w:rPr>
         <w:t>API</w:t>
       </w:r>
@@ -1177,7 +1228,8 @@
         <w:rPr>
           <w:rFonts w:ascii="Times New Roman" w:hAnsi="Times New Roman" w:cs="Times New Roman"/>
           <w:spacing w:val="-4"/>
-          <w:sz w:val="20"/>
+          <w:sz w:val="28"/>
+          <w:szCs w:val="28"/>
         </w:rPr>
         <w:t xml:space="preserve"> </w:t>
       </w:r>
@@ -1185,14 +1237,16 @@
         <w:rPr>
           <w:rFonts w:ascii="Times New Roman" w:hAnsi="Times New Roman" w:cs="Times New Roman"/>
           <w:spacing w:val="-2"/>
-          <w:sz w:val="20"/>
+          <w:sz w:val="28"/>
+          <w:szCs w:val="28"/>
         </w:rPr>
         <w:t>Catalogue.</w:t>
       </w:r>
       <w:r>
         <w:rPr>
           <w:rFonts w:ascii="Times New Roman" w:hAnsi="Times New Roman" w:cs="Times New Roman"/>
-          <w:sz w:val="20"/>
+          <w:sz w:val="28"/>
+          <w:szCs w:val="28"/>
         </w:rPr>
         <w:tab/>
       </w:r>
@@ -1200,19 +1254,15 @@
         <w:rPr>
           <w:rFonts w:ascii="Times New Roman" w:hAnsi="Times New Roman" w:cs="Times New Roman"/>
           <w:spacing w:val="-10"/>
-          <w:sz w:val="20"/>
-        </w:rPr>
-        <w:t>8</w:t>
-      </w:r>
-    </w:p>
-    <w:p>
-      <w:pPr>
-        <w:pStyle w:val="ListParagraph"/>
+          <w:sz w:val="28"/>
+          <w:szCs w:val="28"/>
+        </w:rPr>
+        <w:t>5</w:t>
+      </w:r>
+    </w:p>
+    <w:p>
+      <w:pPr>
         <w:widowControl w:val="0"/>
-        <w:numPr>
-          <w:ilvl w:val="0"/>
-          <w:numId w:val="1"/>
-        </w:numPr>
         <w:tabs>
           <w:tab w:val="left" w:pos="359"/>
           <w:tab w:val="right" w:leader="dot" w:pos="8982"/>
@@ -1220,17 +1270,25 @@
         <w:autoSpaceDE w:val="0"/>
         <w:autoSpaceDN w:val="0"/>
         <w:spacing w:before="229" w:after="0" w:line="240" w:lineRule="auto"/>
-        <w:ind w:left="359" w:hanging="359"/>
-        <w:contextualSpacing w:val="0"/>
-        <w:rPr>
-          <w:rFonts w:ascii="Times New Roman" w:hAnsi="Times New Roman" w:cs="Times New Roman"/>
-          <w:sz w:val="23"/>
-        </w:rPr>
-      </w:pPr>
-      <w:r>
-        <w:rPr>
-          <w:rFonts w:ascii="Times New Roman" w:hAnsi="Times New Roman" w:cs="Times New Roman"/>
-          <w:sz w:val="23"/>
+        <w:rPr>
+          <w:rFonts w:ascii="Times New Roman" w:hAnsi="Times New Roman" w:cs="Times New Roman"/>
+          <w:sz w:val="28"/>
+          <w:szCs w:val="28"/>
+        </w:rPr>
+      </w:pPr>
+      <w:r>
+        <w:rPr>
+          <w:rFonts w:ascii="Times New Roman" w:hAnsi="Times New Roman" w:cs="Times New Roman"/>
+          <w:sz w:val="28"/>
+          <w:szCs w:val="28"/>
+        </w:rPr>
+        <w:t>3.</w:t>
+      </w:r>
+      <w:r>
+        <w:rPr>
+          <w:rFonts w:ascii="Times New Roman" w:hAnsi="Times New Roman" w:cs="Times New Roman"/>
+          <w:sz w:val="28"/>
+          <w:szCs w:val="28"/>
         </w:rPr>
         <w:t>Data</w:t>
       </w:r>
@@ -1238,7 +1296,8 @@
         <w:rPr>
           <w:rFonts w:ascii="Times New Roman" w:hAnsi="Times New Roman" w:cs="Times New Roman"/>
           <w:spacing w:val="-1"/>
-          <w:sz w:val="23"/>
+          <w:sz w:val="28"/>
+          <w:szCs w:val="28"/>
         </w:rPr>
         <w:t xml:space="preserve"> </w:t>
       </w:r>
@@ -1246,14 +1305,16 @@
         <w:rPr>
           <w:rFonts w:ascii="Times New Roman" w:hAnsi="Times New Roman" w:cs="Times New Roman"/>
           <w:spacing w:val="-2"/>
-          <w:sz w:val="23"/>
+          <w:sz w:val="28"/>
+          <w:szCs w:val="28"/>
         </w:rPr>
         <w:t>Design.</w:t>
       </w:r>
       <w:r>
         <w:rPr>
           <w:rFonts w:ascii="Times New Roman" w:hAnsi="Times New Roman" w:cs="Times New Roman"/>
-          <w:sz w:val="23"/>
+          <w:sz w:val="28"/>
+          <w:szCs w:val="28"/>
         </w:rPr>
         <w:tab/>
       </w:r>
@@ -1261,9 +1322,10 @@
         <w:rPr>
           <w:rFonts w:ascii="Times New Roman" w:hAnsi="Times New Roman" w:cs="Times New Roman"/>
           <w:spacing w:val="-10"/>
-          <w:sz w:val="23"/>
-        </w:rPr>
-        <w:t>8</w:t>
+          <w:sz w:val="28"/>
+          <w:szCs w:val="28"/>
+        </w:rPr>
+        <w:t>6</w:t>
       </w:r>
     </w:p>
     <w:p>
@@ -1285,13 +1347,15 @@
         <w:contextualSpacing w:val="0"/>
         <w:rPr>
           <w:rFonts w:ascii="Times New Roman" w:hAnsi="Times New Roman" w:cs="Times New Roman"/>
-          <w:sz w:val="20"/>
-        </w:rPr>
-      </w:pPr>
-      <w:r>
-        <w:rPr>
-          <w:rFonts w:ascii="Times New Roman" w:hAnsi="Times New Roman" w:cs="Times New Roman"/>
-          <w:sz w:val="20"/>
+          <w:sz w:val="28"/>
+          <w:szCs w:val="28"/>
+        </w:rPr>
+      </w:pPr>
+      <w:r>
+        <w:rPr>
+          <w:rFonts w:ascii="Times New Roman" w:hAnsi="Times New Roman" w:cs="Times New Roman"/>
+          <w:sz w:val="28"/>
+          <w:szCs w:val="28"/>
         </w:rPr>
         <w:t>Data</w:t>
       </w:r>
@@ -1299,7 +1363,8 @@
         <w:rPr>
           <w:rFonts w:ascii="Times New Roman" w:hAnsi="Times New Roman" w:cs="Times New Roman"/>
           <w:spacing w:val="-4"/>
-          <w:sz w:val="20"/>
+          <w:sz w:val="28"/>
+          <w:szCs w:val="28"/>
         </w:rPr>
         <w:t xml:space="preserve"> </w:t>
       </w:r>
@@ -1307,24 +1372,26 @@
         <w:rPr>
           <w:rFonts w:ascii="Times New Roman" w:hAnsi="Times New Roman" w:cs="Times New Roman"/>
           <w:spacing w:val="-2"/>
-          <w:sz w:val="20"/>
+          <w:sz w:val="28"/>
+          <w:szCs w:val="28"/>
         </w:rPr>
         <w:t>Model</w:t>
       </w:r>
       <w:r>
         <w:rPr>
           <w:rFonts w:ascii="Times New Roman" w:hAnsi="Times New Roman" w:cs="Times New Roman"/>
-          <w:sz w:val="20"/>
+          <w:sz w:val="28"/>
+          <w:szCs w:val="28"/>
         </w:rPr>
         <w:tab/>
       </w:r>
       <w:r>
         <w:rPr>
           <w:rFonts w:ascii="Times New Roman" w:hAnsi="Times New Roman" w:cs="Times New Roman"/>
-          <w:spacing w:val="-10"/>
-          <w:sz w:val="20"/>
-        </w:rPr>
-        <w:t>8</w:t>
+          <w:sz w:val="28"/>
+          <w:szCs w:val="28"/>
+        </w:rPr>
+        <w:t>6</w:t>
       </w:r>
     </w:p>
     <w:p>
@@ -1346,13 +1413,15 @@
         <w:contextualSpacing w:val="0"/>
         <w:rPr>
           <w:rFonts w:ascii="Times New Roman" w:hAnsi="Times New Roman" w:cs="Times New Roman"/>
-          <w:sz w:val="20"/>
-        </w:rPr>
-      </w:pPr>
-      <w:r>
-        <w:rPr>
-          <w:rFonts w:ascii="Times New Roman" w:hAnsi="Times New Roman" w:cs="Times New Roman"/>
-          <w:sz w:val="20"/>
+          <w:sz w:val="28"/>
+          <w:szCs w:val="28"/>
+        </w:rPr>
+      </w:pPr>
+      <w:r>
+        <w:rPr>
+          <w:rFonts w:ascii="Times New Roman" w:hAnsi="Times New Roman" w:cs="Times New Roman"/>
+          <w:sz w:val="28"/>
+          <w:szCs w:val="28"/>
         </w:rPr>
         <w:t>Data</w:t>
       </w:r>
@@ -1360,14 +1429,16 @@
         <w:rPr>
           <w:rFonts w:ascii="Times New Roman" w:hAnsi="Times New Roman" w:cs="Times New Roman"/>
           <w:spacing w:val="-5"/>
-          <w:sz w:val="20"/>
+          <w:sz w:val="28"/>
+          <w:szCs w:val="28"/>
         </w:rPr>
         <w:t xml:space="preserve"> </w:t>
       </w:r>
       <w:r>
         <w:rPr>
           <w:rFonts w:ascii="Times New Roman" w:hAnsi="Times New Roman" w:cs="Times New Roman"/>
-          <w:sz w:val="20"/>
+          <w:sz w:val="28"/>
+          <w:szCs w:val="28"/>
         </w:rPr>
         <w:t>Access</w:t>
       </w:r>
@@ -1375,7 +1446,8 @@
         <w:rPr>
           <w:rFonts w:ascii="Times New Roman" w:hAnsi="Times New Roman" w:cs="Times New Roman"/>
           <w:spacing w:val="-6"/>
-          <w:sz w:val="20"/>
+          <w:sz w:val="28"/>
+          <w:szCs w:val="28"/>
         </w:rPr>
         <w:t xml:space="preserve"> </w:t>
       </w:r>
@@ -1383,14 +1455,16 @@
         <w:rPr>
           <w:rFonts w:ascii="Times New Roman" w:hAnsi="Times New Roman" w:cs="Times New Roman"/>
           <w:spacing w:val="-2"/>
-          <w:sz w:val="20"/>
+          <w:sz w:val="28"/>
+          <w:szCs w:val="28"/>
         </w:rPr>
         <w:t>Mechanism</w:t>
       </w:r>
       <w:r>
         <w:rPr>
           <w:rFonts w:ascii="Times New Roman" w:hAnsi="Times New Roman" w:cs="Times New Roman"/>
-          <w:sz w:val="20"/>
+          <w:sz w:val="28"/>
+          <w:szCs w:val="28"/>
         </w:rPr>
         <w:tab/>
       </w:r>
@@ -1398,9 +1472,10 @@
         <w:rPr>
           <w:rFonts w:ascii="Times New Roman" w:hAnsi="Times New Roman" w:cs="Times New Roman"/>
           <w:spacing w:val="-10"/>
-          <w:sz w:val="20"/>
-        </w:rPr>
-        <w:t>9</w:t>
+          <w:sz w:val="28"/>
+          <w:szCs w:val="28"/>
+        </w:rPr>
+        <w:t>6</w:t>
       </w:r>
     </w:p>
     <w:p>
@@ -1422,13 +1497,15 @@
         <w:contextualSpacing w:val="0"/>
         <w:rPr>
           <w:rFonts w:ascii="Times New Roman" w:hAnsi="Times New Roman" w:cs="Times New Roman"/>
-          <w:sz w:val="20"/>
-        </w:rPr>
-      </w:pPr>
-      <w:r>
-        <w:rPr>
-          <w:rFonts w:ascii="Times New Roman" w:hAnsi="Times New Roman" w:cs="Times New Roman"/>
-          <w:sz w:val="20"/>
+          <w:sz w:val="28"/>
+          <w:szCs w:val="28"/>
+        </w:rPr>
+      </w:pPr>
+      <w:r>
+        <w:rPr>
+          <w:rFonts w:ascii="Times New Roman" w:hAnsi="Times New Roman" w:cs="Times New Roman"/>
+          <w:sz w:val="28"/>
+          <w:szCs w:val="28"/>
         </w:rPr>
         <w:t>Data</w:t>
       </w:r>
@@ -1436,14 +1513,16 @@
         <w:rPr>
           <w:rFonts w:ascii="Times New Roman" w:hAnsi="Times New Roman" w:cs="Times New Roman"/>
           <w:spacing w:val="-6"/>
-          <w:sz w:val="20"/>
+          <w:sz w:val="28"/>
+          <w:szCs w:val="28"/>
         </w:rPr>
         <w:t xml:space="preserve"> </w:t>
       </w:r>
       <w:r>
         <w:rPr>
           <w:rFonts w:ascii="Times New Roman" w:hAnsi="Times New Roman" w:cs="Times New Roman"/>
-          <w:sz w:val="20"/>
+          <w:sz w:val="28"/>
+          <w:szCs w:val="28"/>
         </w:rPr>
         <w:t>Retention</w:t>
       </w:r>
@@ -1451,7 +1530,8 @@
         <w:rPr>
           <w:rFonts w:ascii="Times New Roman" w:hAnsi="Times New Roman" w:cs="Times New Roman"/>
           <w:spacing w:val="-5"/>
-          <w:sz w:val="20"/>
+          <w:sz w:val="28"/>
+          <w:szCs w:val="28"/>
         </w:rPr>
         <w:t xml:space="preserve"> </w:t>
       </w:r>
@@ -1459,14 +1539,16 @@
         <w:rPr>
           <w:rFonts w:ascii="Times New Roman" w:hAnsi="Times New Roman" w:cs="Times New Roman"/>
           <w:spacing w:val="-2"/>
-          <w:sz w:val="20"/>
+          <w:sz w:val="28"/>
+          <w:szCs w:val="28"/>
         </w:rPr>
         <w:t>Policies</w:t>
       </w:r>
       <w:r>
         <w:rPr>
           <w:rFonts w:ascii="Times New Roman" w:hAnsi="Times New Roman" w:cs="Times New Roman"/>
-          <w:sz w:val="20"/>
+          <w:sz w:val="28"/>
+          <w:szCs w:val="28"/>
         </w:rPr>
         <w:tab/>
       </w:r>
@@ -1474,9 +1556,10 @@
         <w:rPr>
           <w:rFonts w:ascii="Times New Roman" w:hAnsi="Times New Roman" w:cs="Times New Roman"/>
           <w:spacing w:val="-10"/>
-          <w:sz w:val="20"/>
-        </w:rPr>
-        <w:t>9</w:t>
+          <w:sz w:val="28"/>
+          <w:szCs w:val="28"/>
+        </w:rPr>
+        <w:t>6</w:t>
       </w:r>
     </w:p>
     <w:p>
@@ -1498,13 +1581,15 @@
         <w:contextualSpacing w:val="0"/>
         <w:rPr>
           <w:rFonts w:ascii="Times New Roman" w:hAnsi="Times New Roman" w:cs="Times New Roman"/>
-          <w:sz w:val="20"/>
-        </w:rPr>
-      </w:pPr>
-      <w:r>
-        <w:rPr>
-          <w:rFonts w:ascii="Times New Roman" w:hAnsi="Times New Roman" w:cs="Times New Roman"/>
-          <w:sz w:val="20"/>
+          <w:sz w:val="28"/>
+          <w:szCs w:val="28"/>
+        </w:rPr>
+      </w:pPr>
+      <w:r>
+        <w:rPr>
+          <w:rFonts w:ascii="Times New Roman" w:hAnsi="Times New Roman" w:cs="Times New Roman"/>
+          <w:sz w:val="28"/>
+          <w:szCs w:val="28"/>
         </w:rPr>
         <w:t>Data</w:t>
       </w:r>
@@ -1512,7 +1597,8 @@
         <w:rPr>
           <w:rFonts w:ascii="Times New Roman" w:hAnsi="Times New Roman" w:cs="Times New Roman"/>
           <w:spacing w:val="-4"/>
-          <w:sz w:val="20"/>
+          <w:sz w:val="28"/>
+          <w:szCs w:val="28"/>
         </w:rPr>
         <w:t xml:space="preserve"> </w:t>
       </w:r>
@@ -1520,14 +1606,16 @@
         <w:rPr>
           <w:rFonts w:ascii="Times New Roman" w:hAnsi="Times New Roman" w:cs="Times New Roman"/>
           <w:spacing w:val="-2"/>
-          <w:sz w:val="20"/>
+          <w:sz w:val="28"/>
+          <w:szCs w:val="28"/>
         </w:rPr>
         <w:t>Migration</w:t>
       </w:r>
       <w:r>
         <w:rPr>
           <w:rFonts w:ascii="Times New Roman" w:hAnsi="Times New Roman" w:cs="Times New Roman"/>
-          <w:sz w:val="20"/>
+          <w:sz w:val="28"/>
+          <w:szCs w:val="28"/>
         </w:rPr>
         <w:tab/>
       </w:r>
@@ -1535,19 +1623,15 @@
         <w:rPr>
           <w:rFonts w:ascii="Times New Roman" w:hAnsi="Times New Roman" w:cs="Times New Roman"/>
           <w:spacing w:val="-10"/>
-          <w:sz w:val="20"/>
-        </w:rPr>
-        <w:t>9</w:t>
-      </w:r>
-    </w:p>
-    <w:p>
-      <w:pPr>
-        <w:pStyle w:val="ListParagraph"/>
+          <w:sz w:val="28"/>
+          <w:szCs w:val="28"/>
+        </w:rPr>
+        <w:t>6</w:t>
+      </w:r>
+    </w:p>
+    <w:p>
+      <w:pPr>
         <w:widowControl w:val="0"/>
-        <w:numPr>
-          <w:ilvl w:val="0"/>
-          <w:numId w:val="1"/>
-        </w:numPr>
         <w:tabs>
           <w:tab w:val="left" w:pos="359"/>
           <w:tab w:val="right" w:leader="dot" w:pos="9033"/>
@@ -1555,25 +1639,35 @@
         <w:autoSpaceDE w:val="0"/>
         <w:autoSpaceDN w:val="0"/>
         <w:spacing w:before="230" w:after="0" w:line="240" w:lineRule="auto"/>
-        <w:ind w:left="359" w:hanging="359"/>
-        <w:contextualSpacing w:val="0"/>
-        <w:rPr>
-          <w:rFonts w:ascii="Times New Roman" w:hAnsi="Times New Roman" w:cs="Times New Roman"/>
-          <w:sz w:val="23"/>
+        <w:rPr>
+          <w:rFonts w:ascii="Times New Roman" w:hAnsi="Times New Roman" w:cs="Times New Roman"/>
+          <w:sz w:val="28"/>
+          <w:szCs w:val="28"/>
         </w:rPr>
       </w:pPr>
       <w:r>
         <w:rPr>
           <w:rFonts w:ascii="Times New Roman" w:hAnsi="Times New Roman" w:cs="Times New Roman"/>
           <w:spacing w:val="-2"/>
-          <w:sz w:val="23"/>
+          <w:sz w:val="28"/>
+          <w:szCs w:val="28"/>
+        </w:rPr>
+        <w:t>4.</w:t>
+      </w:r>
+      <w:r>
+        <w:rPr>
+          <w:rFonts w:ascii="Times New Roman" w:hAnsi="Times New Roman" w:cs="Times New Roman"/>
+          <w:spacing w:val="-2"/>
+          <w:sz w:val="28"/>
+          <w:szCs w:val="28"/>
         </w:rPr>
         <w:t>Interfaces</w:t>
       </w:r>
       <w:r>
         <w:rPr>
           <w:rFonts w:ascii="Times New Roman" w:hAnsi="Times New Roman" w:cs="Times New Roman"/>
-          <w:sz w:val="23"/>
+          <w:sz w:val="28"/>
+          <w:szCs w:val="28"/>
         </w:rPr>
         <w:tab/>
       </w:r>
@@ -1581,19 +1675,15 @@
         <w:rPr>
           <w:rFonts w:ascii="Times New Roman" w:hAnsi="Times New Roman" w:cs="Times New Roman"/>
           <w:spacing w:val="-10"/>
-          <w:sz w:val="23"/>
-        </w:rPr>
-        <w:t>9</w:t>
-      </w:r>
-    </w:p>
-    <w:p>
-      <w:pPr>
-        <w:pStyle w:val="ListParagraph"/>
+          <w:sz w:val="28"/>
+          <w:szCs w:val="28"/>
+        </w:rPr>
+        <w:t>7</w:t>
+      </w:r>
+    </w:p>
+    <w:p>
+      <w:pPr>
         <w:widowControl w:val="0"/>
-        <w:numPr>
-          <w:ilvl w:val="0"/>
-          <w:numId w:val="1"/>
-        </w:numPr>
         <w:tabs>
           <w:tab w:val="left" w:pos="359"/>
           <w:tab w:val="right" w:leader="dot" w:pos="9037"/>
@@ -1601,17 +1691,25 @@
         <w:autoSpaceDE w:val="0"/>
         <w:autoSpaceDN w:val="0"/>
         <w:spacing w:before="263" w:after="0" w:line="240" w:lineRule="auto"/>
-        <w:ind w:left="359" w:hanging="359"/>
-        <w:contextualSpacing w:val="0"/>
-        <w:rPr>
-          <w:rFonts w:ascii="Times New Roman" w:hAnsi="Times New Roman" w:cs="Times New Roman"/>
-          <w:sz w:val="23"/>
-        </w:rPr>
-      </w:pPr>
-      <w:r>
-        <w:rPr>
-          <w:rFonts w:ascii="Times New Roman" w:hAnsi="Times New Roman" w:cs="Times New Roman"/>
-          <w:sz w:val="23"/>
+        <w:rPr>
+          <w:rFonts w:ascii="Times New Roman" w:hAnsi="Times New Roman" w:cs="Times New Roman"/>
+          <w:sz w:val="28"/>
+          <w:szCs w:val="28"/>
+        </w:rPr>
+      </w:pPr>
+      <w:r>
+        <w:rPr>
+          <w:rFonts w:ascii="Times New Roman" w:hAnsi="Times New Roman" w:cs="Times New Roman"/>
+          <w:sz w:val="28"/>
+          <w:szCs w:val="28"/>
+        </w:rPr>
+        <w:t>5.</w:t>
+      </w:r>
+      <w:r>
+        <w:rPr>
+          <w:rFonts w:ascii="Times New Roman" w:hAnsi="Times New Roman" w:cs="Times New Roman"/>
+          <w:sz w:val="28"/>
+          <w:szCs w:val="28"/>
         </w:rPr>
         <w:t>State</w:t>
       </w:r>
@@ -1619,14 +1717,16 @@
         <w:rPr>
           <w:rFonts w:ascii="Times New Roman" w:hAnsi="Times New Roman" w:cs="Times New Roman"/>
           <w:spacing w:val="-4"/>
-          <w:sz w:val="23"/>
+          <w:sz w:val="28"/>
+          <w:szCs w:val="28"/>
         </w:rPr>
         <w:t xml:space="preserve"> </w:t>
       </w:r>
       <w:r>
         <w:rPr>
           <w:rFonts w:ascii="Times New Roman" w:hAnsi="Times New Roman" w:cs="Times New Roman"/>
-          <w:sz w:val="23"/>
+          <w:sz w:val="28"/>
+          <w:szCs w:val="28"/>
         </w:rPr>
         <w:t>and</w:t>
       </w:r>
@@ -1634,14 +1734,16 @@
         <w:rPr>
           <w:rFonts w:ascii="Times New Roman" w:hAnsi="Times New Roman" w:cs="Times New Roman"/>
           <w:spacing w:val="-1"/>
-          <w:sz w:val="23"/>
+          <w:sz w:val="28"/>
+          <w:szCs w:val="28"/>
         </w:rPr>
         <w:t xml:space="preserve"> </w:t>
       </w:r>
       <w:r>
         <w:rPr>
           <w:rFonts w:ascii="Times New Roman" w:hAnsi="Times New Roman" w:cs="Times New Roman"/>
-          <w:sz w:val="23"/>
+          <w:sz w:val="28"/>
+          <w:szCs w:val="28"/>
         </w:rPr>
         <w:t>Session</w:t>
       </w:r>
@@ -1649,7 +1751,8 @@
         <w:rPr>
           <w:rFonts w:ascii="Times New Roman" w:hAnsi="Times New Roman" w:cs="Times New Roman"/>
           <w:spacing w:val="-1"/>
-          <w:sz w:val="23"/>
+          <w:sz w:val="28"/>
+          <w:szCs w:val="28"/>
         </w:rPr>
         <w:t xml:space="preserve"> </w:t>
       </w:r>
@@ -1657,14 +1760,16 @@
         <w:rPr>
           <w:rFonts w:ascii="Times New Roman" w:hAnsi="Times New Roman" w:cs="Times New Roman"/>
           <w:spacing w:val="-2"/>
-          <w:sz w:val="23"/>
+          <w:sz w:val="28"/>
+          <w:szCs w:val="28"/>
         </w:rPr>
         <w:t>Management</w:t>
       </w:r>
       <w:r>
         <w:rPr>
           <w:rFonts w:ascii="Times New Roman" w:hAnsi="Times New Roman" w:cs="Times New Roman"/>
-          <w:sz w:val="23"/>
+          <w:sz w:val="28"/>
+          <w:szCs w:val="28"/>
         </w:rPr>
         <w:tab/>
       </w:r>
@@ -1672,19 +1777,15 @@
         <w:rPr>
           <w:rFonts w:ascii="Times New Roman" w:hAnsi="Times New Roman" w:cs="Times New Roman"/>
           <w:spacing w:val="-7"/>
-          <w:sz w:val="23"/>
-        </w:rPr>
-        <w:t>10</w:t>
-      </w:r>
-    </w:p>
-    <w:p>
-      <w:pPr>
-        <w:pStyle w:val="ListParagraph"/>
+          <w:sz w:val="28"/>
+          <w:szCs w:val="28"/>
+        </w:rPr>
+        <w:t>7</w:t>
+      </w:r>
+    </w:p>
+    <w:p>
+      <w:pPr>
         <w:widowControl w:val="0"/>
-        <w:numPr>
-          <w:ilvl w:val="0"/>
-          <w:numId w:val="1"/>
-        </w:numPr>
         <w:tabs>
           <w:tab w:val="left" w:pos="359"/>
           <w:tab w:val="right" w:leader="dot" w:pos="9006"/>
@@ -1692,25 +1793,35 @@
         <w:autoSpaceDE w:val="0"/>
         <w:autoSpaceDN w:val="0"/>
         <w:spacing w:before="266" w:after="0" w:line="240" w:lineRule="auto"/>
-        <w:ind w:left="359" w:hanging="359"/>
-        <w:contextualSpacing w:val="0"/>
-        <w:rPr>
-          <w:rFonts w:ascii="Times New Roman" w:hAnsi="Times New Roman" w:cs="Times New Roman"/>
-          <w:sz w:val="23"/>
+        <w:rPr>
+          <w:rFonts w:ascii="Times New Roman" w:hAnsi="Times New Roman" w:cs="Times New Roman"/>
+          <w:sz w:val="28"/>
+          <w:szCs w:val="28"/>
         </w:rPr>
       </w:pPr>
       <w:r>
         <w:rPr>
           <w:rFonts w:ascii="Times New Roman" w:hAnsi="Times New Roman" w:cs="Times New Roman"/>
           <w:spacing w:val="-2"/>
-          <w:sz w:val="23"/>
+          <w:sz w:val="28"/>
+          <w:szCs w:val="28"/>
+        </w:rPr>
+        <w:t>6.</w:t>
+      </w:r>
+      <w:r>
+        <w:rPr>
+          <w:rFonts w:ascii="Times New Roman" w:hAnsi="Times New Roman" w:cs="Times New Roman"/>
+          <w:spacing w:val="-2"/>
+          <w:sz w:val="28"/>
+          <w:szCs w:val="28"/>
         </w:rPr>
         <w:t>Caching</w:t>
       </w:r>
       <w:r>
         <w:rPr>
           <w:rFonts w:ascii="Times New Roman" w:hAnsi="Times New Roman" w:cs="Times New Roman"/>
-          <w:sz w:val="23"/>
+          <w:sz w:val="28"/>
+          <w:szCs w:val="28"/>
         </w:rPr>
         <w:tab/>
       </w:r>
@@ -1718,19 +1829,15 @@
         <w:rPr>
           <w:rFonts w:ascii="Times New Roman" w:hAnsi="Times New Roman" w:cs="Times New Roman"/>
           <w:spacing w:val="-5"/>
-          <w:sz w:val="23"/>
-        </w:rPr>
-        <w:t>10</w:t>
-      </w:r>
-    </w:p>
-    <w:p>
-      <w:pPr>
-        <w:pStyle w:val="ListParagraph"/>
+          <w:sz w:val="28"/>
+          <w:szCs w:val="28"/>
+        </w:rPr>
+        <w:t>7</w:t>
+      </w:r>
+    </w:p>
+    <w:p>
+      <w:pPr>
         <w:widowControl w:val="0"/>
-        <w:numPr>
-          <w:ilvl w:val="0"/>
-          <w:numId w:val="1"/>
-        </w:numPr>
         <w:tabs>
           <w:tab w:val="left" w:pos="359"/>
           <w:tab w:val="right" w:leader="dot" w:pos="8962"/>
@@ -1738,17 +1845,25 @@
         <w:autoSpaceDE w:val="0"/>
         <w:autoSpaceDN w:val="0"/>
         <w:spacing w:before="264" w:after="0" w:line="240" w:lineRule="auto"/>
-        <w:ind w:left="359" w:hanging="359"/>
-        <w:contextualSpacing w:val="0"/>
-        <w:rPr>
-          <w:rFonts w:ascii="Times New Roman" w:hAnsi="Times New Roman" w:cs="Times New Roman"/>
-          <w:sz w:val="23"/>
-        </w:rPr>
-      </w:pPr>
-      <w:r>
-        <w:rPr>
-          <w:rFonts w:ascii="Times New Roman" w:hAnsi="Times New Roman" w:cs="Times New Roman"/>
-          <w:sz w:val="23"/>
+        <w:rPr>
+          <w:rFonts w:ascii="Times New Roman" w:hAnsi="Times New Roman" w:cs="Times New Roman"/>
+          <w:sz w:val="28"/>
+          <w:szCs w:val="28"/>
+        </w:rPr>
+      </w:pPr>
+      <w:r>
+        <w:rPr>
+          <w:rFonts w:ascii="Times New Roman" w:hAnsi="Times New Roman" w:cs="Times New Roman"/>
+          <w:sz w:val="28"/>
+          <w:szCs w:val="28"/>
+        </w:rPr>
+        <w:t>7.</w:t>
+      </w:r>
+      <w:r>
+        <w:rPr>
+          <w:rFonts w:ascii="Times New Roman" w:hAnsi="Times New Roman" w:cs="Times New Roman"/>
+          <w:sz w:val="28"/>
+          <w:szCs w:val="28"/>
         </w:rPr>
         <w:t>Non-Functional</w:t>
       </w:r>
@@ -1756,7 +1871,8 @@
         <w:rPr>
           <w:rFonts w:ascii="Times New Roman" w:hAnsi="Times New Roman" w:cs="Times New Roman"/>
           <w:spacing w:val="-5"/>
-          <w:sz w:val="23"/>
+          <w:sz w:val="28"/>
+          <w:szCs w:val="28"/>
         </w:rPr>
         <w:t xml:space="preserve"> </w:t>
       </w:r>
@@ -1764,14 +1880,16 @@
         <w:rPr>
           <w:rFonts w:ascii="Times New Roman" w:hAnsi="Times New Roman" w:cs="Times New Roman"/>
           <w:spacing w:val="-2"/>
-          <w:sz w:val="23"/>
+          <w:sz w:val="28"/>
+          <w:szCs w:val="28"/>
         </w:rPr>
         <w:t>Requirements</w:t>
       </w:r>
       <w:r>
         <w:rPr>
           <w:rFonts w:ascii="Times New Roman" w:hAnsi="Times New Roman" w:cs="Times New Roman"/>
-          <w:sz w:val="23"/>
+          <w:sz w:val="28"/>
+          <w:szCs w:val="28"/>
         </w:rPr>
         <w:tab/>
       </w:r>
@@ -1779,9 +1897,10 @@
         <w:rPr>
           <w:rFonts w:ascii="Times New Roman" w:hAnsi="Times New Roman" w:cs="Times New Roman"/>
           <w:spacing w:val="-5"/>
-          <w:sz w:val="23"/>
-        </w:rPr>
-        <w:t>10</w:t>
+          <w:sz w:val="28"/>
+          <w:szCs w:val="28"/>
+        </w:rPr>
+        <w:t>7</w:t>
       </w:r>
     </w:p>
     <w:p>
@@ -1803,13 +1922,15 @@
         <w:contextualSpacing w:val="0"/>
         <w:rPr>
           <w:rFonts w:ascii="Times New Roman" w:hAnsi="Times New Roman" w:cs="Times New Roman"/>
-          <w:sz w:val="20"/>
-        </w:rPr>
-      </w:pPr>
-      <w:r>
-        <w:rPr>
-          <w:rFonts w:ascii="Times New Roman" w:hAnsi="Times New Roman" w:cs="Times New Roman"/>
-          <w:sz w:val="20"/>
+          <w:sz w:val="28"/>
+          <w:szCs w:val="28"/>
+        </w:rPr>
+      </w:pPr>
+      <w:r>
+        <w:rPr>
+          <w:rFonts w:ascii="Times New Roman" w:hAnsi="Times New Roman" w:cs="Times New Roman"/>
+          <w:sz w:val="28"/>
+          <w:szCs w:val="28"/>
         </w:rPr>
         <w:t>Security</w:t>
       </w:r>
@@ -1817,7 +1938,8 @@
         <w:rPr>
           <w:rFonts w:ascii="Times New Roman" w:hAnsi="Times New Roman" w:cs="Times New Roman"/>
           <w:spacing w:val="-6"/>
-          <w:sz w:val="20"/>
+          <w:sz w:val="28"/>
+          <w:szCs w:val="28"/>
         </w:rPr>
         <w:t xml:space="preserve"> </w:t>
       </w:r>
@@ -1825,14 +1947,16 @@
         <w:rPr>
           <w:rFonts w:ascii="Times New Roman" w:hAnsi="Times New Roman" w:cs="Times New Roman"/>
           <w:spacing w:val="-2"/>
-          <w:sz w:val="20"/>
+          <w:sz w:val="28"/>
+          <w:szCs w:val="28"/>
         </w:rPr>
         <w:t>Aspects</w:t>
       </w:r>
       <w:r>
         <w:rPr>
           <w:rFonts w:ascii="Times New Roman" w:hAnsi="Times New Roman" w:cs="Times New Roman"/>
-          <w:sz w:val="20"/>
+          <w:sz w:val="28"/>
+          <w:szCs w:val="28"/>
         </w:rPr>
         <w:tab/>
       </w:r>
@@ -1840,9 +1964,10 @@
         <w:rPr>
           <w:rFonts w:ascii="Times New Roman" w:hAnsi="Times New Roman" w:cs="Times New Roman"/>
           <w:spacing w:val="-5"/>
-          <w:sz w:val="20"/>
-        </w:rPr>
-        <w:t>10</w:t>
+          <w:sz w:val="28"/>
+          <w:szCs w:val="28"/>
+        </w:rPr>
+        <w:t>7</w:t>
       </w:r>
     </w:p>
     <w:p>
@@ -1864,13 +1989,15 @@
         <w:contextualSpacing w:val="0"/>
         <w:rPr>
           <w:rFonts w:ascii="Times New Roman" w:hAnsi="Times New Roman" w:cs="Times New Roman"/>
-          <w:sz w:val="20"/>
-        </w:rPr>
-      </w:pPr>
-      <w:r>
-        <w:rPr>
-          <w:rFonts w:ascii="Times New Roman" w:hAnsi="Times New Roman" w:cs="Times New Roman"/>
-          <w:sz w:val="20"/>
+          <w:sz w:val="28"/>
+          <w:szCs w:val="28"/>
+        </w:rPr>
+      </w:pPr>
+      <w:r>
+        <w:rPr>
+          <w:rFonts w:ascii="Times New Roman" w:hAnsi="Times New Roman" w:cs="Times New Roman"/>
+          <w:sz w:val="28"/>
+          <w:szCs w:val="28"/>
         </w:rPr>
         <w:t>Performance</w:t>
       </w:r>
@@ -1878,7 +2005,8 @@
         <w:rPr>
           <w:rFonts w:ascii="Times New Roman" w:hAnsi="Times New Roman" w:cs="Times New Roman"/>
           <w:spacing w:val="-9"/>
-          <w:sz w:val="20"/>
+          <w:sz w:val="28"/>
+          <w:szCs w:val="28"/>
         </w:rPr>
         <w:t xml:space="preserve"> </w:t>
       </w:r>
@@ -1886,14 +2014,16 @@
         <w:rPr>
           <w:rFonts w:ascii="Times New Roman" w:hAnsi="Times New Roman" w:cs="Times New Roman"/>
           <w:spacing w:val="-2"/>
-          <w:sz w:val="20"/>
+          <w:sz w:val="28"/>
+          <w:szCs w:val="28"/>
         </w:rPr>
         <w:t>Aspects</w:t>
       </w:r>
       <w:r>
         <w:rPr>
           <w:rFonts w:ascii="Times New Roman" w:hAnsi="Times New Roman" w:cs="Times New Roman"/>
-          <w:sz w:val="20"/>
+          <w:sz w:val="28"/>
+          <w:szCs w:val="28"/>
         </w:rPr>
         <w:tab/>
       </w:r>
@@ -1901,19 +2031,15 @@
         <w:rPr>
           <w:rFonts w:ascii="Times New Roman" w:hAnsi="Times New Roman" w:cs="Times New Roman"/>
           <w:spacing w:val="-5"/>
-          <w:sz w:val="20"/>
-        </w:rPr>
-        <w:t>10</w:t>
-      </w:r>
-    </w:p>
-    <w:p>
-      <w:pPr>
-        <w:pStyle w:val="ListParagraph"/>
+          <w:sz w:val="28"/>
+          <w:szCs w:val="28"/>
+        </w:rPr>
+        <w:t>8</w:t>
+      </w:r>
+    </w:p>
+    <w:p>
+      <w:pPr>
         <w:widowControl w:val="0"/>
-        <w:numPr>
-          <w:ilvl w:val="0"/>
-          <w:numId w:val="1"/>
-        </w:numPr>
         <w:tabs>
           <w:tab w:val="left" w:pos="359"/>
           <w:tab w:val="right" w:leader="dot" w:pos="9033"/>
@@ -1921,25 +2047,35 @@
         <w:autoSpaceDE w:val="0"/>
         <w:autoSpaceDN w:val="0"/>
         <w:spacing w:before="230" w:after="0" w:line="240" w:lineRule="auto"/>
-        <w:ind w:left="359" w:hanging="359"/>
-        <w:contextualSpacing w:val="0"/>
-        <w:rPr>
-          <w:rFonts w:ascii="Times New Roman" w:hAnsi="Times New Roman" w:cs="Times New Roman"/>
-          <w:sz w:val="23"/>
+        <w:rPr>
+          <w:rFonts w:ascii="Times New Roman" w:hAnsi="Times New Roman" w:cs="Times New Roman"/>
+          <w:sz w:val="28"/>
+          <w:szCs w:val="28"/>
         </w:rPr>
       </w:pPr>
       <w:r>
         <w:rPr>
           <w:rFonts w:ascii="Times New Roman" w:hAnsi="Times New Roman" w:cs="Times New Roman"/>
           <w:spacing w:val="-2"/>
-          <w:sz w:val="23"/>
+          <w:sz w:val="28"/>
+          <w:szCs w:val="28"/>
+        </w:rPr>
+        <w:t>8.</w:t>
+      </w:r>
+      <w:r>
+        <w:rPr>
+          <w:rFonts w:ascii="Times New Roman" w:hAnsi="Times New Roman" w:cs="Times New Roman"/>
+          <w:spacing w:val="-2"/>
+          <w:sz w:val="28"/>
+          <w:szCs w:val="28"/>
         </w:rPr>
         <w:t>References</w:t>
       </w:r>
       <w:r>
         <w:rPr>
           <w:rFonts w:ascii="Times New Roman" w:hAnsi="Times New Roman" w:cs="Times New Roman"/>
-          <w:sz w:val="23"/>
+          <w:sz w:val="28"/>
+          <w:szCs w:val="28"/>
         </w:rPr>
         <w:tab/>
       </w:r>
@@ -1947,9 +2083,10 @@
         <w:rPr>
           <w:rFonts w:ascii="Times New Roman" w:hAnsi="Times New Roman" w:cs="Times New Roman"/>
           <w:spacing w:val="-5"/>
-          <w:sz w:val="23"/>
-        </w:rPr>
-        <w:t>11</w:t>
+          <w:sz w:val="28"/>
+          <w:szCs w:val="28"/>
+        </w:rPr>
+        <w:t>8</w:t>
       </w:r>
     </w:p>
     <w:p>
@@ -2558,7 +2695,25 @@
           <w:sz w:val="28"/>
           <w:szCs w:val="28"/>
         </w:rPr>
-        <w:t>Presentation Tier: Streamlit-based web dashboard.</w:t>
+        <w:t xml:space="preserve">Presentation Tier: </w:t>
+      </w:r>
+      <w:proofErr w:type="spellStart"/>
+      <w:r>
+        <w:rPr>
+          <w:rFonts w:ascii="Times New Roman" w:hAnsi="Times New Roman" w:cs="Times New Roman"/>
+          <w:sz w:val="28"/>
+          <w:szCs w:val="28"/>
+        </w:rPr>
+        <w:t>Streamlit</w:t>
+      </w:r>
+      <w:proofErr w:type="spellEnd"/>
+      <w:r>
+        <w:rPr>
+          <w:rFonts w:ascii="Times New Roman" w:hAnsi="Times New Roman" w:cs="Times New Roman"/>
+          <w:sz w:val="28"/>
+          <w:szCs w:val="28"/>
+        </w:rPr>
+        <w:t>-based web dashboard.</w:t>
       </w:r>
       <w:r>
         <w:rPr>
@@ -3543,7 +3698,7 @@
           <w:sz w:val="28"/>
           <w:szCs w:val="28"/>
         </w:rPr>
-        <w:t xml:space="preserve"> </w:t>
+        <w:t>_</w:t>
       </w:r>
       <w:proofErr w:type="gramStart"/>
       <w:r>
@@ -3591,6 +3746,7 @@
         </w:rPr>
         <w:t xml:space="preserve"> </w:t>
       </w:r>
+      <w:proofErr w:type="spellStart"/>
       <w:r>
         <w:rPr>
           <w:rFonts w:ascii="Times New Roman" w:hAnsi="Times New Roman" w:cs="Times New Roman"/>
@@ -3613,7 +3769,7 @@
           <w:sz w:val="28"/>
           <w:szCs w:val="28"/>
         </w:rPr>
-        <w:t xml:space="preserve"> </w:t>
+        <w:t>_</w:t>
       </w:r>
       <w:proofErr w:type="gramStart"/>
       <w:r>
@@ -3622,7 +3778,16 @@
           <w:sz w:val="28"/>
           <w:szCs w:val="28"/>
         </w:rPr>
-        <w:t>metric(</w:t>
+        <w:t>metric</w:t>
+      </w:r>
+      <w:proofErr w:type="spellEnd"/>
+      <w:r>
+        <w:rPr>
+          <w:rFonts w:ascii="Times New Roman" w:hAnsi="Times New Roman" w:cs="Times New Roman"/>
+          <w:sz w:val="28"/>
+          <w:szCs w:val="28"/>
+        </w:rPr>
+        <w:t>(</w:t>
       </w:r>
       <w:proofErr w:type="gramEnd"/>
       <w:r>
@@ -3661,6 +3826,7 @@
         </w:rPr>
         <w:t xml:space="preserve"> </w:t>
       </w:r>
+      <w:proofErr w:type="spellStart"/>
       <w:r>
         <w:rPr>
           <w:rFonts w:ascii="Times New Roman" w:hAnsi="Times New Roman" w:cs="Times New Roman"/>
@@ -3683,7 +3849,49 @@
           <w:sz w:val="28"/>
           <w:szCs w:val="28"/>
         </w:rPr>
-        <w:t xml:space="preserve"> </w:t>
+        <w:t>_</w:t>
+      </w:r>
+      <w:r>
+        <w:rPr>
+          <w:rFonts w:ascii="Times New Roman" w:hAnsi="Times New Roman" w:cs="Times New Roman"/>
+          <w:sz w:val="28"/>
+          <w:szCs w:val="28"/>
+        </w:rPr>
+        <w:t>warning</w:t>
+      </w:r>
+      <w:proofErr w:type="spellEnd"/>
+      <w:r>
+        <w:rPr>
+          <w:rFonts w:ascii="Times New Roman" w:hAnsi="Times New Roman" w:cs="Times New Roman"/>
+          <w:sz w:val="28"/>
+          <w:szCs w:val="28"/>
+        </w:rPr>
+        <w:t>()</w:t>
+      </w:r>
+      <w:r>
+        <w:rPr>
+          <w:rFonts w:ascii="Times New Roman" w:hAnsi="Times New Roman" w:cs="Times New Roman"/>
+          <w:sz w:val="28"/>
+          <w:szCs w:val="28"/>
+        </w:rPr>
+        <w:t>:</w:t>
+      </w:r>
+      <w:proofErr w:type="spellStart"/>
+      <w:r>
+        <w:rPr>
+          <w:rFonts w:ascii="Times New Roman" w:hAnsi="Times New Roman" w:cs="Times New Roman"/>
+          <w:sz w:val="28"/>
+          <w:szCs w:val="28"/>
+        </w:rPr>
+        <w:t>st</w:t>
+      </w:r>
+      <w:r>
+        <w:rPr>
+          <w:rFonts w:ascii="Times New Roman" w:hAnsi="Times New Roman" w:cs="Times New Roman"/>
+          <w:sz w:val="28"/>
+          <w:szCs w:val="28"/>
+        </w:rPr>
+        <w:t>_</w:t>
       </w:r>
       <w:proofErr w:type="gramStart"/>
       <w:r>
@@ -3692,49 +3900,16 @@
           <w:sz w:val="28"/>
           <w:szCs w:val="28"/>
         </w:rPr>
-        <w:t>warning(</w:t>
-      </w:r>
-      <w:proofErr w:type="gramEnd"/>
-      <w:r>
-        <w:rPr>
-          <w:rFonts w:ascii="Times New Roman" w:hAnsi="Times New Roman" w:cs="Times New Roman"/>
-          <w:sz w:val="28"/>
-          <w:szCs w:val="28"/>
-        </w:rPr>
-        <w:t>)</w:t>
-      </w:r>
-      <w:r>
-        <w:rPr>
-          <w:rFonts w:ascii="Times New Roman" w:hAnsi="Times New Roman" w:cs="Times New Roman"/>
-          <w:sz w:val="28"/>
-          <w:szCs w:val="28"/>
-        </w:rPr>
-        <w:t>:</w:t>
-      </w:r>
-      <w:r>
-        <w:rPr>
-          <w:rFonts w:ascii="Times New Roman" w:hAnsi="Times New Roman" w:cs="Times New Roman"/>
-          <w:sz w:val="28"/>
-          <w:szCs w:val="28"/>
-        </w:rPr>
-        <w:t>st</w:t>
-      </w:r>
-      <w:r>
-        <w:rPr>
-          <w:rFonts w:ascii="Times New Roman" w:hAnsi="Times New Roman" w:cs="Times New Roman"/>
-          <w:sz w:val="28"/>
-          <w:szCs w:val="28"/>
-        </w:rPr>
-        <w:t xml:space="preserve"> </w:t>
-      </w:r>
-      <w:proofErr w:type="gramStart"/>
-      <w:r>
-        <w:rPr>
-          <w:rFonts w:ascii="Times New Roman" w:hAnsi="Times New Roman" w:cs="Times New Roman"/>
-          <w:sz w:val="28"/>
-          <w:szCs w:val="28"/>
-        </w:rPr>
-        <w:t>success(</w:t>
+        <w:t>success</w:t>
+      </w:r>
+      <w:proofErr w:type="spellEnd"/>
+      <w:r>
+        <w:rPr>
+          <w:rFonts w:ascii="Times New Roman" w:hAnsi="Times New Roman" w:cs="Times New Roman"/>
+          <w:sz w:val="28"/>
+          <w:szCs w:val="28"/>
+        </w:rPr>
+        <w:t>(</w:t>
       </w:r>
       <w:proofErr w:type="gramEnd"/>
       <w:r>
@@ -5431,20 +5606,7 @@
                             <w:rPr>
                               <w:sz w:val="22"/>
                             </w:rPr>
-                            <w:t>UNIVERSITY</w:t>
-                          </w:r>
-                          <w:r>
-                            <w:rPr>
-                              <w:spacing w:val="-9"/>
-                              <w:sz w:val="22"/>
-                            </w:rPr>
-                            <w:t xml:space="preserve"> </w:t>
-                          </w:r>
-                          <w:r>
-                            <w:rPr>
-                              <w:sz w:val="22"/>
-                            </w:rPr>
-                            <w:t>NAME</w:t>
+                            <w:t>YENEPOYA</w:t>
                           </w:r>
                           <w:r>
                             <w:rPr>
@@ -5515,20 +5677,7 @@
                       <w:rPr>
                         <w:sz w:val="22"/>
                       </w:rPr>
-                      <w:t>UNIVERSITY</w:t>
-                    </w:r>
-                    <w:r>
-                      <w:rPr>
-                        <w:spacing w:val="-9"/>
-                        <w:sz w:val="22"/>
-                      </w:rPr>
-                      <w:t xml:space="preserve"> </w:t>
-                    </w:r>
-                    <w:r>
-                      <w:rPr>
-                        <w:sz w:val="22"/>
-                      </w:rPr>
-                      <w:t>NAME</w:t>
+                      <w:t>YENEPOYA</w:t>
                     </w:r>
                     <w:r>
                       <w:rPr>

</xml_diff>